<commit_message>
Informes: apuntes de la reunion del 25-sep (problema en 6.1, datos descargados, IC del error diario)
Co-Authored-By: Claude Opus 5.5 <noreply@anthropic.com>
</commit_message>
<xml_diff>
--- a/docs/Informe_Avance_ABET_Barcelo_Dede.docx
+++ b/docs/Informe_Avance_ABET_Barcelo_Dede.docx
@@ -202,7 +202,7 @@
       <w:bookmarkStart w:id="0" w:name="_Toc240440229"/>
       <w:bookmarkStart w:id="1" w:name="_Toc241072106"/>
       <w:bookmarkStart w:id="2" w:name="_Toc241072472"/>
-      <w:bookmarkStart w:id="3" w:name="_Toc241498831"/>
+      <w:bookmarkStart w:id="3" w:name="_Toc241499433"/>
       <w:r>
         <w:lastRenderedPageBreak/>
         <w:t>Tabla de contenido</w:t>
@@ -238,7 +238,7 @@
       <w:r>
         <w:fldChar w:fldCharType="separate"/>
       </w:r>
-      <w:hyperlink w:anchor="_Toc241498831" w:history="1">
+      <w:hyperlink w:anchor="_Toc241499433" w:history="1">
         <w:r>
           <w:rPr>
             <w:rStyle w:val="Hyperlink"/>
@@ -265,7 +265,7 @@
             <w:noProof/>
             <w:webHidden/>
           </w:rPr>
-          <w:instrText xml:space="preserve"> PAGEREF _Toc241498831 \h </w:instrText>
+          <w:instrText xml:space="preserve"> PAGEREF _Toc241499433 \h </w:instrText>
         </w:r>
         <w:r>
           <w:rPr>
@@ -314,7 +314,7 @@
           <w:lang w:eastAsia="es-CO"/>
         </w:rPr>
       </w:pPr>
-      <w:hyperlink w:anchor="_Toc241498832" w:history="1">
+      <w:hyperlink w:anchor="_Toc241499434" w:history="1">
         <w:r>
           <w:rPr>
             <w:rStyle w:val="Hyperlink"/>
@@ -361,7 +361,7 @@
             <w:noProof/>
             <w:webHidden/>
           </w:rPr>
-          <w:instrText xml:space="preserve"> PAGEREF _Toc241498832 \h </w:instrText>
+          <w:instrText xml:space="preserve"> PAGEREF _Toc241499434 \h </w:instrText>
         </w:r>
         <w:r>
           <w:rPr>
@@ -408,7 +408,7 @@
           <w:lang w:eastAsia="es-CO"/>
         </w:rPr>
       </w:pPr>
-      <w:hyperlink w:anchor="_Toc241498833" w:history="1">
+      <w:hyperlink w:anchor="_Toc241499435" w:history="1">
         <w:r>
           <w:rPr>
             <w:rStyle w:val="Hyperlink"/>
@@ -453,7 +453,7 @@
             <w:noProof/>
             <w:webHidden/>
           </w:rPr>
-          <w:instrText xml:space="preserve"> PAGEREF _Toc241498833 \h </w:instrText>
+          <w:instrText xml:space="preserve"> PAGEREF _Toc241499435 \h </w:instrText>
         </w:r>
         <w:r>
           <w:rPr>
@@ -500,7 +500,7 @@
           <w:lang w:eastAsia="es-CO"/>
         </w:rPr>
       </w:pPr>
-      <w:hyperlink w:anchor="_Toc241498834" w:history="1">
+      <w:hyperlink w:anchor="_Toc241499436" w:history="1">
         <w:r>
           <w:rPr>
             <w:rStyle w:val="Hyperlink"/>
@@ -545,7 +545,7 @@
             <w:noProof/>
             <w:webHidden/>
           </w:rPr>
-          <w:instrText xml:space="preserve"> PAGEREF _Toc241498834 \h </w:instrText>
+          <w:instrText xml:space="preserve"> PAGEREF _Toc241499436 \h </w:instrText>
         </w:r>
         <w:r>
           <w:rPr>
@@ -592,7 +592,7 @@
           <w:lang w:eastAsia="es-CO"/>
         </w:rPr>
       </w:pPr>
-      <w:hyperlink w:anchor="_Toc241498835" w:history="1">
+      <w:hyperlink w:anchor="_Toc241499437" w:history="1">
         <w:r>
           <w:rPr>
             <w:rStyle w:val="Hyperlink"/>
@@ -637,7 +637,7 @@
             <w:noProof/>
             <w:webHidden/>
           </w:rPr>
-          <w:instrText xml:space="preserve"> PAGEREF _Toc241498835 \h </w:instrText>
+          <w:instrText xml:space="preserve"> PAGEREF _Toc241499437 \h </w:instrText>
         </w:r>
         <w:r>
           <w:rPr>
@@ -686,7 +686,7 @@
           <w:lang w:eastAsia="es-CO"/>
         </w:rPr>
       </w:pPr>
-      <w:hyperlink w:anchor="_Toc241498836" w:history="1">
+      <w:hyperlink w:anchor="_Toc241499438" w:history="1">
         <w:r>
           <w:rPr>
             <w:rStyle w:val="Hyperlink"/>
@@ -733,7 +733,7 @@
             <w:noProof/>
             <w:webHidden/>
           </w:rPr>
-          <w:instrText xml:space="preserve"> PAGEREF _Toc241498836 \h </w:instrText>
+          <w:instrText xml:space="preserve"> PAGEREF _Toc241499438 \h </w:instrText>
         </w:r>
         <w:r>
           <w:rPr>
@@ -782,7 +782,7 @@
           <w:lang w:eastAsia="es-CO"/>
         </w:rPr>
       </w:pPr>
-      <w:hyperlink w:anchor="_Toc241498837" w:history="1">
+      <w:hyperlink w:anchor="_Toc241499439" w:history="1">
         <w:r>
           <w:rPr>
             <w:rStyle w:val="Hyperlink"/>
@@ -829,7 +829,7 @@
             <w:noProof/>
             <w:webHidden/>
           </w:rPr>
-          <w:instrText xml:space="preserve"> PAGEREF _Toc241498837 \h </w:instrText>
+          <w:instrText xml:space="preserve"> PAGEREF _Toc241499439 \h </w:instrText>
         </w:r>
         <w:r>
           <w:rPr>
@@ -876,7 +876,7 @@
           <w:lang w:eastAsia="es-CO"/>
         </w:rPr>
       </w:pPr>
-      <w:hyperlink w:anchor="_Toc241498838" w:history="1">
+      <w:hyperlink w:anchor="_Toc241499440" w:history="1">
         <w:r>
           <w:rPr>
             <w:rStyle w:val="Hyperlink"/>
@@ -921,7 +921,7 @@
             <w:noProof/>
             <w:webHidden/>
           </w:rPr>
-          <w:instrText xml:space="preserve"> PAGEREF _Toc241498838 \h </w:instrText>
+          <w:instrText xml:space="preserve"> PAGEREF _Toc241499440 \h </w:instrText>
         </w:r>
         <w:r>
           <w:rPr>
@@ -968,7 +968,7 @@
           <w:lang w:eastAsia="es-CO"/>
         </w:rPr>
       </w:pPr>
-      <w:hyperlink w:anchor="_Toc241498839" w:history="1">
+      <w:hyperlink w:anchor="_Toc241499441" w:history="1">
         <w:r>
           <w:rPr>
             <w:rStyle w:val="Hyperlink"/>
@@ -1013,7 +1013,7 @@
             <w:noProof/>
             <w:webHidden/>
           </w:rPr>
-          <w:instrText xml:space="preserve"> PAGEREF _Toc241498839 \h </w:instrText>
+          <w:instrText xml:space="preserve"> PAGEREF _Toc241499441 \h </w:instrText>
         </w:r>
         <w:r>
           <w:rPr>
@@ -1062,7 +1062,7 @@
           <w:lang w:eastAsia="es-CO"/>
         </w:rPr>
       </w:pPr>
-      <w:hyperlink w:anchor="_Toc241498840" w:history="1">
+      <w:hyperlink w:anchor="_Toc241499442" w:history="1">
         <w:r>
           <w:rPr>
             <w:rStyle w:val="Hyperlink"/>
@@ -1109,7 +1109,7 @@
             <w:noProof/>
             <w:webHidden/>
           </w:rPr>
-          <w:instrText xml:space="preserve"> PAGEREF _Toc241498840 \h </w:instrText>
+          <w:instrText xml:space="preserve"> PAGEREF _Toc241499442 \h </w:instrText>
         </w:r>
         <w:r>
           <w:rPr>
@@ -1156,7 +1156,7 @@
           <w:lang w:eastAsia="es-CO"/>
         </w:rPr>
       </w:pPr>
-      <w:hyperlink w:anchor="_Toc241498841" w:history="1">
+      <w:hyperlink w:anchor="_Toc241499443" w:history="1">
         <w:r>
           <w:rPr>
             <w:rStyle w:val="Hyperlink"/>
@@ -1201,7 +1201,7 @@
             <w:noProof/>
             <w:webHidden/>
           </w:rPr>
-          <w:instrText xml:space="preserve"> PAGEREF _Toc241498841 \h </w:instrText>
+          <w:instrText xml:space="preserve"> PAGEREF _Toc241499443 \h </w:instrText>
         </w:r>
         <w:r>
           <w:rPr>
@@ -1248,7 +1248,7 @@
           <w:lang w:eastAsia="es-CO"/>
         </w:rPr>
       </w:pPr>
-      <w:hyperlink w:anchor="_Toc241498842" w:history="1">
+      <w:hyperlink w:anchor="_Toc241499444" w:history="1">
         <w:r>
           <w:rPr>
             <w:rStyle w:val="Hyperlink"/>
@@ -1293,7 +1293,7 @@
             <w:noProof/>
             <w:webHidden/>
           </w:rPr>
-          <w:instrText xml:space="preserve"> PAGEREF _Toc241498842 \h </w:instrText>
+          <w:instrText xml:space="preserve"> PAGEREF _Toc241499444 \h </w:instrText>
         </w:r>
         <w:r>
           <w:rPr>
@@ -1340,7 +1340,7 @@
           <w:lang w:eastAsia="es-CO"/>
         </w:rPr>
       </w:pPr>
-      <w:hyperlink w:anchor="_Toc241498843" w:history="1">
+      <w:hyperlink w:anchor="_Toc241499445" w:history="1">
         <w:r>
           <w:rPr>
             <w:rStyle w:val="Hyperlink"/>
@@ -1385,7 +1385,7 @@
             <w:noProof/>
             <w:webHidden/>
           </w:rPr>
-          <w:instrText xml:space="preserve"> PAGEREF _Toc241498843 \h </w:instrText>
+          <w:instrText xml:space="preserve"> PAGEREF _Toc241499445 \h </w:instrText>
         </w:r>
         <w:r>
           <w:rPr>
@@ -1434,7 +1434,7 @@
           <w:lang w:eastAsia="es-CO"/>
         </w:rPr>
       </w:pPr>
-      <w:hyperlink w:anchor="_Toc241498844" w:history="1">
+      <w:hyperlink w:anchor="_Toc241499446" w:history="1">
         <w:r>
           <w:rPr>
             <w:rStyle w:val="Hyperlink"/>
@@ -1481,7 +1481,7 @@
             <w:noProof/>
             <w:webHidden/>
           </w:rPr>
-          <w:instrText xml:space="preserve"> PAGEREF _Toc241498844 \h </w:instrText>
+          <w:instrText xml:space="preserve"> PAGEREF _Toc241499446 \h </w:instrText>
         </w:r>
         <w:r>
           <w:rPr>
@@ -1528,7 +1528,7 @@
           <w:lang w:eastAsia="es-CO"/>
         </w:rPr>
       </w:pPr>
-      <w:hyperlink w:anchor="_Toc241498845" w:history="1">
+      <w:hyperlink w:anchor="_Toc241499447" w:history="1">
         <w:r>
           <w:rPr>
             <w:rStyle w:val="Hyperlink"/>
@@ -1573,7 +1573,7 @@
             <w:noProof/>
             <w:webHidden/>
           </w:rPr>
-          <w:instrText xml:space="preserve"> PAGEREF _Toc241498845 \h </w:instrText>
+          <w:instrText xml:space="preserve"> PAGEREF _Toc241499447 \h </w:instrText>
         </w:r>
         <w:r>
           <w:rPr>
@@ -1620,7 +1620,7 @@
           <w:lang w:eastAsia="es-CO"/>
         </w:rPr>
       </w:pPr>
-      <w:hyperlink w:anchor="_Toc241498846" w:history="1">
+      <w:hyperlink w:anchor="_Toc241499448" w:history="1">
         <w:r>
           <w:rPr>
             <w:rStyle w:val="Hyperlink"/>
@@ -1665,7 +1665,7 @@
             <w:noProof/>
             <w:webHidden/>
           </w:rPr>
-          <w:instrText xml:space="preserve"> PAGEREF _Toc241498846 \h </w:instrText>
+          <w:instrText xml:space="preserve"> PAGEREF _Toc241499448 \h </w:instrText>
         </w:r>
         <w:r>
           <w:rPr>
@@ -1714,7 +1714,7 @@
           <w:lang w:eastAsia="es-CO"/>
         </w:rPr>
       </w:pPr>
-      <w:hyperlink w:anchor="_Toc241498847" w:history="1">
+      <w:hyperlink w:anchor="_Toc241499449" w:history="1">
         <w:r>
           <w:rPr>
             <w:rStyle w:val="Hyperlink"/>
@@ -1761,7 +1761,7 @@
             <w:noProof/>
             <w:webHidden/>
           </w:rPr>
-          <w:instrText xml:space="preserve"> PAGEREF _Toc241498847 \h </w:instrText>
+          <w:instrText xml:space="preserve"> PAGEREF _Toc241499449 \h </w:instrText>
         </w:r>
         <w:r>
           <w:rPr>
@@ -1808,7 +1808,7 @@
           <w:lang w:eastAsia="es-CO"/>
         </w:rPr>
       </w:pPr>
-      <w:hyperlink w:anchor="_Toc241498848" w:history="1">
+      <w:hyperlink w:anchor="_Toc241499450" w:history="1">
         <w:r>
           <w:rPr>
             <w:rStyle w:val="Hyperlink"/>
@@ -1853,7 +1853,7 @@
             <w:noProof/>
             <w:webHidden/>
           </w:rPr>
-          <w:instrText xml:space="preserve"> PAGEREF _Toc241498848 \h </w:instrText>
+          <w:instrText xml:space="preserve"> PAGEREF _Toc241499450 \h </w:instrText>
         </w:r>
         <w:r>
           <w:rPr>
@@ -1900,7 +1900,7 @@
           <w:lang w:eastAsia="es-CO"/>
         </w:rPr>
       </w:pPr>
-      <w:hyperlink w:anchor="_Toc241498849" w:history="1">
+      <w:hyperlink w:anchor="_Toc241499451" w:history="1">
         <w:r>
           <w:rPr>
             <w:rStyle w:val="Hyperlink"/>
@@ -1945,7 +1945,7 @@
             <w:noProof/>
             <w:webHidden/>
           </w:rPr>
-          <w:instrText xml:space="preserve"> PAGEREF _Toc241498849 \h </w:instrText>
+          <w:instrText xml:space="preserve"> PAGEREF _Toc241499451 \h </w:instrText>
         </w:r>
         <w:r>
           <w:rPr>
@@ -1992,7 +1992,7 @@
           <w:lang w:eastAsia="es-CO"/>
         </w:rPr>
       </w:pPr>
-      <w:hyperlink w:anchor="_Toc241498850" w:history="1">
+      <w:hyperlink w:anchor="_Toc241499452" w:history="1">
         <w:r>
           <w:rPr>
             <w:rStyle w:val="Hyperlink"/>
@@ -2037,7 +2037,7 @@
             <w:noProof/>
             <w:webHidden/>
           </w:rPr>
-          <w:instrText xml:space="preserve"> PAGEREF _Toc241498850 \h </w:instrText>
+          <w:instrText xml:space="preserve"> PAGEREF _Toc241499452 \h </w:instrText>
         </w:r>
         <w:r>
           <w:rPr>
@@ -2084,7 +2084,7 @@
           <w:lang w:eastAsia="es-CO"/>
         </w:rPr>
       </w:pPr>
-      <w:hyperlink w:anchor="_Toc241498851" w:history="1">
+      <w:hyperlink w:anchor="_Toc241499453" w:history="1">
         <w:r>
           <w:rPr>
             <w:rStyle w:val="Hyperlink"/>
@@ -2129,7 +2129,7 @@
             <w:noProof/>
             <w:webHidden/>
           </w:rPr>
-          <w:instrText xml:space="preserve"> PAGEREF _Toc241498851 \h </w:instrText>
+          <w:instrText xml:space="preserve"> PAGEREF _Toc241499453 \h </w:instrText>
         </w:r>
         <w:r>
           <w:rPr>
@@ -2176,7 +2176,7 @@
           <w:lang w:eastAsia="es-CO"/>
         </w:rPr>
       </w:pPr>
-      <w:hyperlink w:anchor="_Toc241498852" w:history="1">
+      <w:hyperlink w:anchor="_Toc241499454" w:history="1">
         <w:r>
           <w:rPr>
             <w:rStyle w:val="Hyperlink"/>
@@ -2221,7 +2221,7 @@
             <w:noProof/>
             <w:webHidden/>
           </w:rPr>
-          <w:instrText xml:space="preserve"> PAGEREF _Toc241498852 \h </w:instrText>
+          <w:instrText xml:space="preserve"> PAGEREF _Toc241499454 \h </w:instrText>
         </w:r>
         <w:r>
           <w:rPr>
@@ -2268,7 +2268,7 @@
           <w:lang w:eastAsia="es-CO"/>
         </w:rPr>
       </w:pPr>
-      <w:hyperlink w:anchor="_Toc241498853" w:history="1">
+      <w:hyperlink w:anchor="_Toc241499455" w:history="1">
         <w:r>
           <w:rPr>
             <w:rStyle w:val="Hyperlink"/>
@@ -2313,7 +2313,7 @@
             <w:noProof/>
             <w:webHidden/>
           </w:rPr>
-          <w:instrText xml:space="preserve"> PAGEREF _Toc241498853 \h </w:instrText>
+          <w:instrText xml:space="preserve"> PAGEREF _Toc241499455 \h </w:instrText>
         </w:r>
         <w:r>
           <w:rPr>
@@ -2360,7 +2360,7 @@
           <w:lang w:eastAsia="es-CO"/>
         </w:rPr>
       </w:pPr>
-      <w:hyperlink w:anchor="_Toc241498854" w:history="1">
+      <w:hyperlink w:anchor="_Toc241499456" w:history="1">
         <w:r>
           <w:rPr>
             <w:rStyle w:val="Hyperlink"/>
@@ -2405,7 +2405,7 @@
             <w:noProof/>
             <w:webHidden/>
           </w:rPr>
-          <w:instrText xml:space="preserve"> PAGEREF _Toc241498854 \h </w:instrText>
+          <w:instrText xml:space="preserve"> PAGEREF _Toc241499456 \h </w:instrText>
         </w:r>
         <w:r>
           <w:rPr>
@@ -2425,7 +2425,7 @@
             <w:noProof/>
             <w:webHidden/>
           </w:rPr>
-          <w:t>12</w:t>
+          <w:t>13</w:t>
         </w:r>
         <w:r>
           <w:rPr>
@@ -2454,7 +2454,7 @@
           <w:lang w:eastAsia="es-CO"/>
         </w:rPr>
       </w:pPr>
-      <w:hyperlink w:anchor="_Toc241498855" w:history="1">
+      <w:hyperlink w:anchor="_Toc241499457" w:history="1">
         <w:r>
           <w:rPr>
             <w:rStyle w:val="Hyperlink"/>
@@ -2501,7 +2501,7 @@
             <w:noProof/>
             <w:webHidden/>
           </w:rPr>
-          <w:instrText xml:space="preserve"> PAGEREF _Toc241498855 \h </w:instrText>
+          <w:instrText xml:space="preserve"> PAGEREF _Toc241499457 \h </w:instrText>
         </w:r>
         <w:r>
           <w:rPr>
@@ -2548,7 +2548,7 @@
           <w:lang w:eastAsia="es-CO"/>
         </w:rPr>
       </w:pPr>
-      <w:hyperlink w:anchor="_Toc241498856" w:history="1">
+      <w:hyperlink w:anchor="_Toc241499458" w:history="1">
         <w:r>
           <w:rPr>
             <w:rStyle w:val="Hyperlink"/>
@@ -2593,7 +2593,7 @@
             <w:noProof/>
             <w:webHidden/>
           </w:rPr>
-          <w:instrText xml:space="preserve"> PAGEREF _Toc241498856 \h </w:instrText>
+          <w:instrText xml:space="preserve"> PAGEREF _Toc241499458 \h </w:instrText>
         </w:r>
         <w:r>
           <w:rPr>
@@ -2641,7 +2641,7 @@
           <w:lang w:eastAsia="es-CO"/>
         </w:rPr>
       </w:pPr>
-      <w:hyperlink w:anchor="_Toc241498857" w:history="1">
+      <w:hyperlink w:anchor="_Toc241499459" w:history="1">
         <w:r>
           <w:rPr>
             <w:rStyle w:val="Hyperlink"/>
@@ -2687,7 +2687,7 @@
             <w:noProof/>
             <w:webHidden/>
           </w:rPr>
-          <w:instrText xml:space="preserve"> PAGEREF _Toc241498857 \h </w:instrText>
+          <w:instrText xml:space="preserve"> PAGEREF _Toc241499459 \h </w:instrText>
         </w:r>
         <w:r>
           <w:rPr>
@@ -2735,7 +2735,7 @@
           <w:lang w:eastAsia="es-CO"/>
         </w:rPr>
       </w:pPr>
-      <w:hyperlink w:anchor="_Toc241498858" w:history="1">
+      <w:hyperlink w:anchor="_Toc241499460" w:history="1">
         <w:r>
           <w:rPr>
             <w:rStyle w:val="Hyperlink"/>
@@ -2781,7 +2781,7 @@
             <w:noProof/>
             <w:webHidden/>
           </w:rPr>
-          <w:instrText xml:space="preserve"> PAGEREF _Toc241498858 \h </w:instrText>
+          <w:instrText xml:space="preserve"> PAGEREF _Toc241499460 \h </w:instrText>
         </w:r>
         <w:r>
           <w:rPr>
@@ -2801,7 +2801,7 @@
             <w:noProof/>
             <w:webHidden/>
           </w:rPr>
-          <w:t>17</w:t>
+          <w:t>18</w:t>
         </w:r>
         <w:r>
           <w:rPr>
@@ -2828,7 +2828,7 @@
           <w:lang w:eastAsia="es-CO"/>
         </w:rPr>
       </w:pPr>
-      <w:hyperlink w:anchor="_Toc241498859" w:history="1">
+      <w:hyperlink w:anchor="_Toc241499461" w:history="1">
         <w:r>
           <w:rPr>
             <w:rStyle w:val="Hyperlink"/>
@@ -2873,7 +2873,7 @@
             <w:noProof/>
             <w:webHidden/>
           </w:rPr>
-          <w:instrText xml:space="preserve"> PAGEREF _Toc241498859 \h </w:instrText>
+          <w:instrText xml:space="preserve"> PAGEREF _Toc241499461 \h </w:instrText>
         </w:r>
         <w:r>
           <w:rPr>
@@ -2920,7 +2920,7 @@
           <w:lang w:eastAsia="es-CO"/>
         </w:rPr>
       </w:pPr>
-      <w:hyperlink w:anchor="_Toc241498860" w:history="1">
+      <w:hyperlink w:anchor="_Toc241499462" w:history="1">
         <w:r>
           <w:rPr>
             <w:rStyle w:val="Hyperlink"/>
@@ -2965,7 +2965,7 @@
             <w:noProof/>
             <w:webHidden/>
           </w:rPr>
-          <w:instrText xml:space="preserve"> PAGEREF _Toc241498860 \h </w:instrText>
+          <w:instrText xml:space="preserve"> PAGEREF _Toc241499462 \h </w:instrText>
         </w:r>
         <w:r>
           <w:rPr>
@@ -2985,7 +2985,7 @@
             <w:noProof/>
             <w:webHidden/>
           </w:rPr>
-          <w:t>18</w:t>
+          <w:t>19</w:t>
         </w:r>
         <w:r>
           <w:rPr>
@@ -3012,7 +3012,7 @@
           <w:lang w:eastAsia="es-CO"/>
         </w:rPr>
       </w:pPr>
-      <w:hyperlink w:anchor="_Toc241498861" w:history="1">
+      <w:hyperlink w:anchor="_Toc241499463" w:history="1">
         <w:r>
           <w:rPr>
             <w:rStyle w:val="Hyperlink"/>
@@ -3057,7 +3057,7 @@
             <w:noProof/>
             <w:webHidden/>
           </w:rPr>
-          <w:instrText xml:space="preserve"> PAGEREF _Toc241498861 \h </w:instrText>
+          <w:instrText xml:space="preserve"> PAGEREF _Toc241499463 \h </w:instrText>
         </w:r>
         <w:r>
           <w:rPr>
@@ -3106,7 +3106,7 @@
           <w:lang w:eastAsia="es-CO"/>
         </w:rPr>
       </w:pPr>
-      <w:hyperlink w:anchor="_Toc241498862" w:history="1">
+      <w:hyperlink w:anchor="_Toc241499464" w:history="1">
         <w:r>
           <w:rPr>
             <w:rStyle w:val="Hyperlink"/>
@@ -3153,7 +3153,7 @@
             <w:noProof/>
             <w:webHidden/>
           </w:rPr>
-          <w:instrText xml:space="preserve"> PAGEREF _Toc241498862 \h </w:instrText>
+          <w:instrText xml:space="preserve"> PAGEREF _Toc241499464 \h </w:instrText>
         </w:r>
         <w:r>
           <w:rPr>
@@ -3200,7 +3200,7 @@
           <w:lang w:eastAsia="es-CO"/>
         </w:rPr>
       </w:pPr>
-      <w:hyperlink w:anchor="_Toc241498863" w:history="1">
+      <w:hyperlink w:anchor="_Toc241499465" w:history="1">
         <w:r>
           <w:rPr>
             <w:rStyle w:val="Hyperlink"/>
@@ -3245,7 +3245,7 @@
             <w:noProof/>
             <w:webHidden/>
           </w:rPr>
-          <w:instrText xml:space="preserve"> PAGEREF _Toc241498863 \h </w:instrText>
+          <w:instrText xml:space="preserve"> PAGEREF _Toc241499465 \h </w:instrText>
         </w:r>
         <w:r>
           <w:rPr>
@@ -3292,7 +3292,7 @@
           <w:lang w:eastAsia="es-CO"/>
         </w:rPr>
       </w:pPr>
-      <w:hyperlink w:anchor="_Toc241498864" w:history="1">
+      <w:hyperlink w:anchor="_Toc241499466" w:history="1">
         <w:r>
           <w:rPr>
             <w:rStyle w:val="Hyperlink"/>
@@ -3337,7 +3337,7 @@
             <w:noProof/>
             <w:webHidden/>
           </w:rPr>
-          <w:instrText xml:space="preserve"> PAGEREF _Toc241498864 \h </w:instrText>
+          <w:instrText xml:space="preserve"> PAGEREF _Toc241499466 \h </w:instrText>
         </w:r>
         <w:r>
           <w:rPr>
@@ -3384,7 +3384,7 @@
           <w:lang w:eastAsia="es-CO"/>
         </w:rPr>
       </w:pPr>
-      <w:hyperlink w:anchor="_Toc241498865" w:history="1">
+      <w:hyperlink w:anchor="_Toc241499467" w:history="1">
         <w:r>
           <w:rPr>
             <w:rStyle w:val="Hyperlink"/>
@@ -3429,7 +3429,7 @@
             <w:noProof/>
             <w:webHidden/>
           </w:rPr>
-          <w:instrText xml:space="preserve"> PAGEREF _Toc241498865 \h </w:instrText>
+          <w:instrText xml:space="preserve"> PAGEREF _Toc241499467 \h </w:instrText>
         </w:r>
         <w:r>
           <w:rPr>
@@ -3476,7 +3476,7 @@
           <w:lang w:eastAsia="es-CO"/>
         </w:rPr>
       </w:pPr>
-      <w:hyperlink w:anchor="_Toc241498866" w:history="1">
+      <w:hyperlink w:anchor="_Toc241499468" w:history="1">
         <w:r>
           <w:rPr>
             <w:rStyle w:val="Hyperlink"/>
@@ -3521,7 +3521,7 @@
             <w:noProof/>
             <w:webHidden/>
           </w:rPr>
-          <w:instrText xml:space="preserve"> PAGEREF _Toc241498866 \h </w:instrText>
+          <w:instrText xml:space="preserve"> PAGEREF _Toc241499468 \h </w:instrText>
         </w:r>
         <w:r>
           <w:rPr>
@@ -3570,7 +3570,7 @@
           <w:lang w:eastAsia="es-CO"/>
         </w:rPr>
       </w:pPr>
-      <w:hyperlink w:anchor="_Toc241498867" w:history="1">
+      <w:hyperlink w:anchor="_Toc241499469" w:history="1">
         <w:r>
           <w:rPr>
             <w:rStyle w:val="Hyperlink"/>
@@ -3617,7 +3617,7 @@
             <w:noProof/>
             <w:webHidden/>
           </w:rPr>
-          <w:instrText xml:space="preserve"> PAGEREF _Toc241498867 \h </w:instrText>
+          <w:instrText xml:space="preserve"> PAGEREF _Toc241499469 \h </w:instrText>
         </w:r>
         <w:r>
           <w:rPr>
@@ -3637,7 +3637,7 @@
             <w:noProof/>
             <w:webHidden/>
           </w:rPr>
-          <w:t>23</w:t>
+          <w:t>24</w:t>
         </w:r>
         <w:r>
           <w:rPr>
@@ -3666,7 +3666,7 @@
           <w:lang w:eastAsia="es-CO"/>
         </w:rPr>
       </w:pPr>
-      <w:hyperlink w:anchor="_Toc241498868" w:history="1">
+      <w:hyperlink w:anchor="_Toc241499470" w:history="1">
         <w:r>
           <w:rPr>
             <w:rStyle w:val="Hyperlink"/>
@@ -3713,7 +3713,7 @@
             <w:noProof/>
             <w:webHidden/>
           </w:rPr>
-          <w:instrText xml:space="preserve"> PAGEREF _Toc241498868 \h </w:instrText>
+          <w:instrText xml:space="preserve"> PAGEREF _Toc241499470 \h </w:instrText>
         </w:r>
         <w:r>
           <w:rPr>
@@ -3762,7 +3762,7 @@
           <w:lang w:eastAsia="es-CO"/>
         </w:rPr>
       </w:pPr>
-      <w:hyperlink w:anchor="_Toc241498869" w:history="1">
+      <w:hyperlink w:anchor="_Toc241499471" w:history="1">
         <w:r>
           <w:rPr>
             <w:rStyle w:val="Hyperlink"/>
@@ -3809,7 +3809,7 @@
             <w:noProof/>
             <w:webHidden/>
           </w:rPr>
-          <w:instrText xml:space="preserve"> PAGEREF _Toc241498869 \h </w:instrText>
+          <w:instrText xml:space="preserve"> PAGEREF _Toc241499471 \h </w:instrText>
         </w:r>
         <w:r>
           <w:rPr>
@@ -3863,7 +3863,7 @@
       <w:bookmarkStart w:id="4" w:name="_Toc240440230"/>
       <w:bookmarkStart w:id="5" w:name="_Toc241072107"/>
       <w:bookmarkStart w:id="6" w:name="_Toc241072473"/>
-      <w:bookmarkStart w:id="7" w:name="_Toc241498832"/>
+      <w:bookmarkStart w:id="7" w:name="_Toc241499434"/>
       <w:r>
         <w:lastRenderedPageBreak/>
         <w:t>Información principal del proyecto</w:t>
@@ -3886,7 +3886,7 @@
       <w:bookmarkStart w:id="8" w:name="_Toc240440231"/>
       <w:bookmarkStart w:id="9" w:name="_Toc241072108"/>
       <w:bookmarkStart w:id="10" w:name="_Toc241072474"/>
-      <w:bookmarkStart w:id="11" w:name="_Toc241498833"/>
+      <w:bookmarkStart w:id="11" w:name="_Toc241499435"/>
       <w:r>
         <w:t>Título del proyecto</w:t>
       </w:r>
@@ -3920,7 +3920,7 @@
       <w:bookmarkStart w:id="12" w:name="_Toc240440232"/>
       <w:bookmarkStart w:id="13" w:name="_Toc241072109"/>
       <w:bookmarkStart w:id="14" w:name="_Toc241072475"/>
-      <w:bookmarkStart w:id="15" w:name="_Toc241498834"/>
+      <w:bookmarkStart w:id="15" w:name="_Toc241499436"/>
       <w:r>
         <w:t>Resumen ejecutivo</w:t>
       </w:r>
@@ -3999,7 +3999,7 @@
       <w:bookmarkStart w:id="16" w:name="_Toc240440236"/>
       <w:bookmarkStart w:id="17" w:name="_Toc241072110"/>
       <w:bookmarkStart w:id="18" w:name="_Toc241072476"/>
-      <w:bookmarkStart w:id="19" w:name="_Toc241498835"/>
+      <w:bookmarkStart w:id="19" w:name="_Toc241499437"/>
       <w:r>
         <w:t>Costo total del proyecto</w:t>
       </w:r>
@@ -4889,7 +4889,7 @@
       <w:bookmarkStart w:id="20" w:name="_Toc240440237"/>
       <w:bookmarkStart w:id="21" w:name="_Toc241072111"/>
       <w:bookmarkStart w:id="22" w:name="_Toc241072477"/>
-      <w:bookmarkStart w:id="23" w:name="_Toc241498836"/>
+      <w:bookmarkStart w:id="23" w:name="_Toc241499438"/>
       <w:r>
         <w:lastRenderedPageBreak/>
         <w:t>Introducción</w:t>
@@ -4994,7 +4994,7 @@
       <w:bookmarkStart w:id="24" w:name="_Toc240440238"/>
       <w:bookmarkStart w:id="25" w:name="_Toc241072112"/>
       <w:bookmarkStart w:id="26" w:name="_Toc241072478"/>
-      <w:bookmarkStart w:id="27" w:name="_Toc241498837"/>
+      <w:bookmarkStart w:id="27" w:name="_Toc241499439"/>
       <w:r>
         <w:lastRenderedPageBreak/>
         <w:t>Objetivos</w:t>
@@ -5017,7 +5017,7 @@
       <w:bookmarkStart w:id="28" w:name="_Toc240440239"/>
       <w:bookmarkStart w:id="29" w:name="_Toc241072113"/>
       <w:bookmarkStart w:id="30" w:name="_Toc241072479"/>
-      <w:bookmarkStart w:id="31" w:name="_Toc241498838"/>
+      <w:bookmarkStart w:id="31" w:name="_Toc241499440"/>
       <w:r>
         <w:t>Objetivo general</w:t>
       </w:r>
@@ -5060,7 +5060,7 @@
       <w:bookmarkStart w:id="32" w:name="_Toc240440240"/>
       <w:bookmarkStart w:id="33" w:name="_Toc241072114"/>
       <w:bookmarkStart w:id="34" w:name="_Toc241072480"/>
-      <w:bookmarkStart w:id="35" w:name="_Toc241498839"/>
+      <w:bookmarkStart w:id="35" w:name="_Toc241499441"/>
       <w:r>
         <w:t>Objetivos específicos</w:t>
       </w:r>
@@ -5200,7 +5200,7 @@
       <w:bookmarkStart w:id="36" w:name="_Toc240440241"/>
       <w:bookmarkStart w:id="37" w:name="_Toc241072115"/>
       <w:bookmarkStart w:id="38" w:name="_Toc241072481"/>
-      <w:bookmarkStart w:id="39" w:name="_Toc241498840"/>
+      <w:bookmarkStart w:id="39" w:name="_Toc241499442"/>
       <w:r>
         <w:t>Deli</w:t>
       </w:r>
@@ -5225,7 +5225,7 @@
       <w:bookmarkStart w:id="40" w:name="_Toc240440242"/>
       <w:bookmarkStart w:id="41" w:name="_Toc241072116"/>
       <w:bookmarkStart w:id="42" w:name="_Toc241072482"/>
-      <w:bookmarkStart w:id="43" w:name="_Toc241498841"/>
+      <w:bookmarkStart w:id="43" w:name="_Toc241499443"/>
       <w:r>
         <w:t>Alcances</w:t>
       </w:r>
@@ -5810,7 +5810,7 @@
       <w:bookmarkStart w:id="44" w:name="_Toc240440243"/>
       <w:bookmarkStart w:id="45" w:name="_Toc241072117"/>
       <w:bookmarkStart w:id="46" w:name="_Toc241072483"/>
-      <w:bookmarkStart w:id="47" w:name="_Toc241498842"/>
+      <w:bookmarkStart w:id="47" w:name="_Toc241499444"/>
       <w:r>
         <w:t>Limitaciones</w:t>
       </w:r>
@@ -6240,7 +6240,7 @@
       <w:bookmarkStart w:id="48" w:name="_Toc240440244"/>
       <w:bookmarkStart w:id="49" w:name="_Toc241072118"/>
       <w:bookmarkStart w:id="50" w:name="_Toc241072484"/>
-      <w:bookmarkStart w:id="51" w:name="_Toc241498843"/>
+      <w:bookmarkStart w:id="51" w:name="_Toc241499445"/>
       <w:r>
         <w:t>Entregables</w:t>
       </w:r>
@@ -6584,7 +6584,7 @@
       </w:pPr>
       <w:bookmarkStart w:id="53" w:name="_Toc241072119"/>
       <w:bookmarkStart w:id="54" w:name="_Toc241072485"/>
-      <w:bookmarkStart w:id="55" w:name="_Toc241498844"/>
+      <w:bookmarkStart w:id="55" w:name="_Toc241499446"/>
       <w:r>
         <w:lastRenderedPageBreak/>
         <w:t>Revisión bibliográfica</w:t>
@@ -6610,7 +6610,7 @@
       <w:bookmarkStart w:id="56" w:name="_Toc240440246"/>
       <w:bookmarkStart w:id="57" w:name="_Toc241072120"/>
       <w:bookmarkStart w:id="58" w:name="_Toc241072486"/>
-      <w:bookmarkStart w:id="59" w:name="_Toc241498845"/>
+      <w:bookmarkStart w:id="59" w:name="_Toc241499447"/>
       <w:r>
         <w:t>Planteamiento del problema</w:t>
       </w:r>
@@ -6660,7 +6660,7 @@
           <w:noProof/>
         </w:rPr>
         <w:drawing>
-          <wp:inline distT="0" distB="0" distL="0" distR="0" wp14:anchorId="5B094A22" wp14:editId="0E6DDBFD">
+          <wp:inline distT="0" distB="0" distL="0" distR="0" wp14:anchorId="0D0991EC" wp14:editId="432FD5BD">
             <wp:extent cx="4320000" cy="1753663"/>
             <wp:effectExtent l="0" t="0" r="0" b="0"/>
             <wp:docPr id="1" name="Picture 1"/>
@@ -6806,7 +6806,7 @@
       <w:bookmarkStart w:id="60" w:name="_Toc240440247"/>
       <w:bookmarkStart w:id="61" w:name="_Toc241072121"/>
       <w:bookmarkStart w:id="62" w:name="_Toc241072487"/>
-      <w:bookmarkStart w:id="63" w:name="_Toc241498846"/>
+      <w:bookmarkStart w:id="63" w:name="_Toc241499448"/>
       <w:r>
         <w:lastRenderedPageBreak/>
         <w:t>Descripción de avances tecnológicos</w:t>
@@ -7896,7 +7896,7 @@
       </w:pPr>
       <w:bookmarkStart w:id="65" w:name="_Toc241072122"/>
       <w:bookmarkStart w:id="66" w:name="_Toc241072488"/>
-      <w:bookmarkStart w:id="67" w:name="_Toc241498847"/>
+      <w:bookmarkStart w:id="67" w:name="_Toc241499449"/>
       <w:r>
         <w:t>Descripción detallada del diseño en ingeniería</w:t>
       </w:r>
@@ -7918,7 +7918,7 @@
       <w:bookmarkStart w:id="68" w:name="_Toc240440249"/>
       <w:bookmarkStart w:id="69" w:name="_Toc241072123"/>
       <w:bookmarkStart w:id="70" w:name="_Toc241072489"/>
-      <w:bookmarkStart w:id="71" w:name="_Toc241498848"/>
+      <w:bookmarkStart w:id="71" w:name="_Toc241499450"/>
       <w:r>
         <w:t>Problema</w:t>
       </w:r>
@@ -7933,13 +7933,31 @@
         <w:jc w:val="both"/>
       </w:pPr>
       <w:r>
-        <w:t>Desde el diseño, el problema se traduce en un sistema de procesamiento de señales y decisión con tres bloques acoplados: (1) una cadena de adquisición y acondicionamiento que convierta cinco fuentes de resolución distinta (horaria, diaria y mensual) en una</w:t>
-      </w:r>
-      <w:r>
-        <w:t xml:space="preserve"> señal multivariada horaria continua, sin huecos ni fugas de información; (2) un estimador que, con la información disponible en el instante de corte, produzca la mediana y los cuantiles del precio para las siguientes 1 a 72 horas; y (3) una lógica que con</w:t>
-      </w:r>
-      <w:r>
-        <w:t>vierta ese pronóstico probabilístico en una acción discreta por rol.</w:t>
+        <w:t>Desde el diseño, el problema es la ausencia de un sistema de procesamiento de señales y de gestión que integre los datos del mercado. La información existe y es pública, pero está dispersa en fuentes con resoluciones distintas: XM publica el precio, la dem</w:t>
+      </w:r>
+      <w:r>
+        <w:t>anda y la generación por hora, y el volumen de los embalses y los aportes hídricos por día, mientras que NOAA publica el ONI como un promedio trimestral que se actualiza cada mes. Las plataformas públicas permiten consultar y descargar cada serie por separ</w:t>
+      </w:r>
+      <w:r>
+        <w:t>ado, pero no las sincronizan entre sí ni las convierten en un pronóstico o en una recomendación: un agente que quiera decidir con ellas debe alinearlas a mano y estimar por su cuenta el riesgo de cada hora.</w:t>
+      </w:r>
+    </w:p>
+    <w:p>
+      <w:pPr>
+        <w:spacing w:after="100"/>
+        <w:jc w:val="both"/>
+      </w:pPr>
+      <w:r>
+        <w:t>El diseño resuelve esa ausencia con un sistema de</w:t>
+      </w:r>
+      <w:r>
+        <w:t xml:space="preserve"> procesamiento de señales y decisión de tres bloques acoplados: (1) una cadena de adquisición y acondicionamiento que convierta cinco fuentes de resolución distinta (horaria, diaria y mensual) en una señal multivariada horaria continua, sin huecos ni fugas</w:t>
+      </w:r>
+      <w:r>
+        <w:t xml:space="preserve"> de información; (2) un estimador que, con la información disponible en el instante de corte, produzca la mediana y los cuantiles del precio para las siguientes 1 a 72 horas; y (3) una lógica que convierta ese pronóstico probabilístico en una acción discre</w:t>
+      </w:r>
+      <w:r>
+        <w:t>ta por rol.</w:t>
       </w:r>
     </w:p>
     <w:p>
@@ -7955,7 +7973,7 @@
       <w:bookmarkStart w:id="72" w:name="_Toc240440250"/>
       <w:bookmarkStart w:id="73" w:name="_Toc241072124"/>
       <w:bookmarkStart w:id="74" w:name="_Toc241072490"/>
-      <w:bookmarkStart w:id="75" w:name="_Toc241498849"/>
+      <w:bookmarkStart w:id="75" w:name="_Toc241499451"/>
       <w:r>
         <w:t>Análisis de requerimientos</w:t>
       </w:r>
@@ -8000,10 +8018,7 @@
         <w:t>ambiental</w:t>
       </w:r>
       <w:r>
-        <w:t xml:space="preserve"> (maximizar la eficiencia computaciona</w:t>
-      </w:r>
-      <w:r>
-        <w:t xml:space="preserve">l), </w:t>
+        <w:t xml:space="preserve"> (maximizar la eficiencia computacional), </w:t>
       </w:r>
       <w:r>
         <w:rPr>
@@ -8012,7 +8027,10 @@
         <w:t>social</w:t>
       </w:r>
       <w:r>
-        <w:t xml:space="preserve"> (el sistema apoya la decisión, no la sustituye), </w:t>
+        <w:t xml:space="preserve"> (el sistema apoya la decisión, no la sustituye</w:t>
+      </w:r>
+      <w:r>
+        <w:t xml:space="preserve">), </w:t>
       </w:r>
       <w:r>
         <w:rPr>
@@ -8048,10 +8066,10 @@
         <w:t>Factores</w:t>
       </w:r>
       <w:r>
-        <w:t>: salud pública (las escaladas de precio afectan a insti</w:t>
-      </w:r>
-      <w:r>
-        <w:t>tuciones como las IPS), seguridad (acceso a las APIs), cultural (resistencia a recomendaciones basadas en IA), social (usuarios sin formación en probabilidad) y económico (tasa de cambio, precios de nube).</w:t>
+        <w:t>: salud pública (las escaladas de precio afectan a instituciones como las IPS), seguridad (acceso a las APIs), cu</w:t>
+      </w:r>
+      <w:r>
+        <w:t>ltural (resistencia a recomendaciones basadas en IA), social (usuarios sin formación en probabilidad) y económico (tasa de cambio, precios de nube).</w:t>
       </w:r>
     </w:p>
     <w:p>
@@ -8066,13 +8084,14 @@
         <w:t>Requerimientos del cliente.</w:t>
       </w:r>
       <w:r>
-        <w:t xml:space="preserve"> Generadores y comercia</w:t>
-      </w:r>
-      <w:r>
-        <w:t>lizadores medianos piden pronósticos de 24 a 72 h con una recomendación según su rol, un nivel de confianza visible y un dashboard usable sin conocimientos técnicos. La Tabla 5 muestra su traducción a especificaciones medibles y la evidencia de cada criter</w:t>
-      </w:r>
-      <w:r>
-        <w:t>io.</w:t>
+        <w:t xml:space="preserve"> Generadores y comercializadores medianos piden pronósticos de 24 a 72 h con una</w:t>
+      </w:r>
+      <w:r>
+        <w:t xml:space="preserve"> recomendación según su rol, un nivel de confianza visible y un dashboard usable sin </w:t>
+      </w:r>
+      <w:r>
+        <w:lastRenderedPageBreak/>
+        <w:t>conocimientos técnicos. La Tabla 5 muestra su traducción a especificaciones medibles y la evidencia de cada criterio.</w:t>
       </w:r>
     </w:p>
     <w:p>
@@ -8094,7 +8113,14 @@
           <w:sz w:val="20"/>
           <w:szCs w:val="20"/>
         </w:rPr>
-        <w:t xml:space="preserve"> Traducción de requerimientos y restricciones en especificaciones técnicas medibles.</w:t>
+        <w:t xml:space="preserve"> Traducción de requerimientos y restricciones</w:t>
+      </w:r>
+      <w:r>
+        <w:rPr>
+          <w:sz w:val="20"/>
+          <w:szCs w:val="20"/>
+        </w:rPr>
+        <w:t xml:space="preserve"> en especificaciones técnicas medibles.</w:t>
       </w:r>
     </w:p>
     <w:tbl>
@@ -8295,7 +8321,6 @@
                 <w:sz w:val="17"/>
                 <w:szCs w:val="17"/>
               </w:rPr>
-              <w:lastRenderedPageBreak/>
               <w:t>Horizonte de decisión</w:t>
             </w:r>
           </w:p>
@@ -8777,7 +8802,7 @@
       <w:bookmarkStart w:id="76" w:name="_Toc240440251"/>
       <w:bookmarkStart w:id="77" w:name="_Toc241072125"/>
       <w:bookmarkStart w:id="78" w:name="_Toc241072491"/>
-      <w:bookmarkStart w:id="79" w:name="_Toc241498850"/>
+      <w:bookmarkStart w:id="79" w:name="_Toc241499452"/>
       <w:r>
         <w:t>Estándares, normas y regulaciones</w:t>
       </w:r>
@@ -9105,7 +9130,7 @@
       <w:bookmarkStart w:id="80" w:name="_Toc240440252"/>
       <w:bookmarkStart w:id="81" w:name="_Toc241072126"/>
       <w:bookmarkStart w:id="82" w:name="_Toc241072492"/>
-      <w:bookmarkStart w:id="83" w:name="_Toc241498851"/>
+      <w:bookmarkStart w:id="83" w:name="_Toc241499453"/>
       <w:r>
         <w:t>Altern</w:t>
       </w:r>
@@ -9147,7 +9172,11 @@
         <w:t xml:space="preserve"> Una regresión log-lineal predice el nivel del precio a partir de 15 variables (hidrología, ONI, pandemia, calendario y festivos) y de su propio rezago de 24 h [13], y un componente GARCH(1,1) [24] modela cómo se agrupa la volatilidad d</w:t>
       </w:r>
       <w:r>
-        <w:t>el error en el tiempo; de él sale directamente la banda de incertidumbre. Toda la capacidad de ajuste está en una sola ecuación con parámetros interpretables, que se entrena en segundos. Su limitación es el supuesto de linealidad: en 2026 empata con la per</w:t>
+        <w:t xml:space="preserve">el error en el tiempo; de </w:t>
+      </w:r>
+      <w:r>
+        <w:lastRenderedPageBreak/>
+        <w:t>él sale directamente la banda de incertidumbre. Toda la capacidad de ajuste está en una sola ecuación con parámetros interpretables, que se entrena en segundos. Su limitación es el supuesto de linealidad: en 2026 empata con la per</w:t>
       </w:r>
       <w:r>
         <w:t>sistencia y pierde contra ella en 4 de los 6 orígenes históricos (Tabla 15).</w:t>
@@ -9168,11 +9197,7 @@
         <w:t xml:space="preserve"> La red N-BEATSx [25] descompone la serie en bloques que aprenden por separado componentes como la tendencia y la estac</w:t>
       </w:r>
       <w:r>
-        <w:t xml:space="preserve">ionalidad, con 168 </w:t>
-      </w:r>
-      <w:r>
-        <w:lastRenderedPageBreak/>
-        <w:t xml:space="preserve">h (una semana) de historia y las mismas variables exógenas. No impone una forma funcional fija, por lo que captura relaciones no lineales y pronostica varios horizontes a la vez, pero pierde la interpretación directa de sus parámetros y </w:t>
+        <w:t xml:space="preserve">ionalidad, con 168 h (una semana) de historia y las mismas variables exógenas. No impone una forma funcional fija, por lo que captura relaciones no lineales y pronostica varios horizontes a la vez, pero pierde la interpretación directa de sus parámetros y </w:t>
       </w:r>
       <w:r>
         <w:t>tarda minutos en entrenar. Sus cuantiles se calibran aparte por inferencia conforme.</w:t>
@@ -9604,7 +9629,7 @@
       <w:bookmarkStart w:id="84" w:name="_Toc240440253"/>
       <w:bookmarkStart w:id="85" w:name="_Toc241072127"/>
       <w:bookmarkStart w:id="86" w:name="_Toc241072493"/>
-      <w:bookmarkStart w:id="87" w:name="_Toc241498852"/>
+      <w:bookmarkStart w:id="87" w:name="_Toc241499454"/>
       <w:r>
         <w:t>Evaluación y selección de la alternativa óptima</w:t>
       </w:r>
@@ -10150,17 +10175,14 @@
         <w:jc w:val="both"/>
       </w:pPr>
       <w:r>
+        <w:lastRenderedPageBreak/>
         <w:t>Con estos criterios se construyó la matriz de decisión ponderada de la Sección 6.6. Cada alternativa recibe un puntaje de 1 a 5 por criterio, con reglas fijadas antes de conocer los resultados para no ajustarlas a favor de ninguna. En precisión, el puntaje</w:t>
       </w:r>
       <w:r>
         <w:t xml:space="preserve"> es 5 si el rMAE es menor o igual a 0,75; 4 si es menor o igual a 0,85; 3 si es menor o igual a 0,95; 2 si es menor o igual a 1,00, y 1 si es mayor que 1, es decir, si el modelo pierde contra la persistencia. La robustez usa la misma escala, pero con límit</w:t>
       </w:r>
       <w:r>
-        <w:t xml:space="preserve">es de 0,85 y 0,90 para los puntajes 5 y 4. En costo computacional, el puntaje es 5 si el reentrenamiento toma menos de 1 minuto, 4 </w:t>
-      </w:r>
-      <w:r>
-        <w:lastRenderedPageBreak/>
-        <w:t>si toma menos de 5 y 3 si toma menos de 10. En interpretabilidad, es 5 si los coeficientes del modelo se leen directamente, 3</w:t>
+        <w:t>es de 0,85 y 0,90 para los puntajes 5 y 4. En costo computacional, el puntaje es 5 si el reentrenamiento toma menos de 1 minuto, 4 si toma menos de 5 y 3 si toma menos de 10. En interpretabilidad, es 5 si los coeficientes del modelo se leen directamente, 3</w:t>
       </w:r>
       <w:r>
         <w:t xml:space="preserve"> si solo se conocen los pesos de cada modelo y 2 si es una caja negra. La cobertura de las bandas no se puntúa porque las alternativas 2 y 3 usan la misma banda. Los pesos de los criterios (Tabla 9) reflejan las prioridades del cliente: precisión y robuste</w:t>
@@ -11029,7 +11051,7 @@
       <w:bookmarkStart w:id="88" w:name="_Toc240440255"/>
       <w:bookmarkStart w:id="89" w:name="_Toc241072130"/>
       <w:bookmarkStart w:id="90" w:name="_Toc241072496"/>
-      <w:bookmarkStart w:id="91" w:name="_Toc241498853"/>
+      <w:bookmarkStart w:id="91" w:name="_Toc241499455"/>
       <w:r>
         <w:t>Análisis de riesgo del diseño definitivo</w:t>
       </w:r>
@@ -12012,7 +12034,7 @@
       <w:bookmarkStart w:id="92" w:name="_Toc240440254"/>
       <w:bookmarkStart w:id="93" w:name="_Toc241072129"/>
       <w:bookmarkStart w:id="94" w:name="_Toc241072495"/>
-      <w:bookmarkStart w:id="95" w:name="_Toc241498854"/>
+      <w:bookmarkStart w:id="95" w:name="_Toc241499456"/>
       <w:r>
         <w:t>Diseño definitivo</w:t>
       </w:r>
@@ -12033,11 +12055,7 @@
         <w:t>Metodología de diseño.</w:t>
       </w:r>
       <w:r>
-        <w:t xml:space="preserve"> Cada elemento del sistema (variable, modelo, combinador, calibración y regla de decisión) se definió con el mismo procedimiento: (1) se formula frente a una alternativa o línea base; (2) </w:t>
-      </w:r>
-      <w:r>
-        <w:lastRenderedPageBreak/>
-        <w:t>se evalúa fuera de muestra, con entrenamiento en 2019-2025, ajuste d</w:t>
+        <w:t xml:space="preserve"> Cada elemento del sistema (variable, modelo, combinador, calibración y regla de decisión) se definió con el mismo procedimiento: (1) se formula frente a una alternativa o línea base; (2) se evalúa fuera de muestra, con entrenamiento en 2019-2025, ajuste d</w:t>
       </w:r>
       <w:r>
         <w:t>e hiperparámetros contra 2025 y prueba en 2026; (3) se adopta solo si mejora con significancia en la prueba de Diebold-Mariano (p &lt; 0,05) y, cuando hay aleatoriedad, en las 10 particiones evaluadas; y (4) se documenta en la bitácora del repositorio, inclui</w:t>
@@ -12057,7 +12075,7 @@
           <w:noProof/>
         </w:rPr>
         <w:drawing>
-          <wp:inline distT="0" distB="0" distL="0" distR="0" wp14:anchorId="279D2006" wp14:editId="51E258FA">
+          <wp:inline distT="0" distB="0" distL="0" distR="0" wp14:anchorId="1D2786AF" wp14:editId="1066A4F2">
             <wp:extent cx="3780000" cy="2801707"/>
             <wp:effectExtent l="0" t="0" r="0" b="0"/>
             <wp:docPr id="2" name="Picture 2"/>
@@ -12134,6 +12152,27 @@
     </w:p>
     <w:p>
       <w:pPr>
+        <w:spacing w:after="100"/>
+        <w:jc w:val="both"/>
+      </w:pPr>
+      <w:r>
+        <w:t>De las fuentes públicas se descargaron, para enero de 2019 a agosto de 2026, 66.576 registros horarios de cada una de las tres series horarias de XM (precio de bolsa, demanda real y generación total), 2.776 registros diarios de cada una de las dos ser</w:t>
+      </w:r>
+      <w:r>
+        <w:t>ies hidrológicas (volumen útil de embalses y aportes hídricos) y los 90 valores trimestrales publicados del ONI (de DJF 2019 a MJJ 2026). Cada familia de variables sale de una sola de esas fuentes: las de precio rezagado, medias móviles y volatilidad (9 va</w:t>
+      </w:r>
+      <w:r>
+        <w:t>riables), de la serie horaria de precio; la de demanda (4), de la demanda horaria; la de hidrología (12), seis de los embalses y seis de los aportes; el ONI, de la serie de NOAA; y el indicador de pandemia y las 13 variables de calendario y festivos, de la</w:t>
+      </w:r>
+      <w:r>
+        <w:t xml:space="preserve"> marca de tiempo y del calendario oficial de festivos de Colombia. La generación total se usó en la caracterización, pero no como predictora: su valor en la hora objetivo se fija en el mismo despacho que el precio y su valor rezagado repite la información </w:t>
+      </w:r>
+      <w:r>
+        <w:t>de la demanda, con la que tiene una correlación de 0,996.</w:t>
+      </w:r>
+    </w:p>
+    <w:p>
+      <w:pPr>
         <w:keepNext/>
         <w:spacing w:before="120" w:after="60"/>
         <w:jc w:val="center"/>
@@ -12144,6 +12183,7 @@
           <w:sz w:val="20"/>
           <w:szCs w:val="20"/>
         </w:rPr>
+        <w:lastRenderedPageBreak/>
         <w:t>Tabla 11.</w:t>
       </w:r>
       <w:r>
@@ -12904,7 +12944,6 @@
         <w:rPr>
           <w:b/>
         </w:rPr>
-        <w:lastRenderedPageBreak/>
         <w:t>Definición de modelos.</w:t>
       </w:r>
       <w:r>
@@ -14362,7 +14401,11 @@
         <w:t>t</w:t>
       </w:r>
       <w:r>
-        <w:t xml:space="preserve"> se actualizan iterativamente para minimizar el sMAPE. El producto de 72 h reutiliza el ensamble de 24 h en los pasos 1-23 y combina, en el resto, un LEAR (72 modelos LASSO, uno por paso), dos N-BEATSx y una persistencia semanal.</w:t>
+        <w:t xml:space="preserve"> se actualizan iterativamente para minimizar el sMAPE. El producto de 72 h reutiliza el </w:t>
+      </w:r>
+      <w:r>
+        <w:lastRenderedPageBreak/>
+        <w:t>ensamble de 24 h en los pasos 1-23 y combina, en el resto, un LEAR (72 modelos LASSO, uno por paso), dos N-BEATSx y una persistencia semanal.</w:t>
       </w:r>
     </w:p>
     <w:p>
@@ -14425,7 +14468,6 @@
           <w:sz w:val="20"/>
           <w:szCs w:val="20"/>
         </w:rPr>
-        <w:lastRenderedPageBreak/>
         <w:t>Tabla 13.</w:t>
       </w:r>
       <w:r>
@@ -15401,7 +15443,14 @@
                 <w:sz w:val="16"/>
                 <w:szCs w:val="16"/>
               </w:rPr>
-              <w:t>«banda» gana el promedio pero actúa en el 1,2 % de las horas de la primera mitad; el criterio estable elige «híbrido» (generador) y «rodante» (comercializador) (Tablas 18 y 19)</w:t>
+              <w:t>«banda» gana el promedio pero actúa en el 1,2 % de las horas de la pr</w:t>
+            </w:r>
+            <w:r>
+              <w:rPr>
+                <w:sz w:val="16"/>
+                <w:szCs w:val="16"/>
+              </w:rPr>
+              <w:t>imera mitad; el criterio estable elige «híbrido» (generador) y «rodante» (comercializador) (Tablas 18 y 19)</w:t>
             </w:r>
           </w:p>
         </w:tc>
@@ -15422,28 +15471,29 @@
         <w:rPr>
           <w:b/>
         </w:rPr>
-        <w:t>Motor de decisió</w:t>
-      </w:r>
-      <w:r>
-        <w:rPr>
-          <w:b/>
-        </w:rPr>
-        <w:t>n (cuatro métodos y selección por estabilidad).</w:t>
-      </w:r>
-      <w:r>
-        <w:t xml:space="preserve"> (1) Cada método fija un umbral bajo y uno alto y compara con ellos la mediana q50 de cada hora: por debajo del bajo el comercializador recibe «comprar» y el generador «retener»; por encima del alto, «evitar c</w:t>
-      </w:r>
-      <w:r>
-        <w:t>ompra» y «vender»; en otro caso, «esperar». Los umbrales por defecto son los percentiles 25 y 75, el rango intercuartílico convencional para separar valores típicos de extremos [31]. (2) Los métodos difieren en la referencia: «fijo» usa los percentiles del</w:t>
-      </w:r>
-      <w:r>
-        <w:t xml:space="preserve"> precio de entrenamiento 2019-2025; «rodante», los de una ventana móvil causal de 30 días sobre q50, que se adapta al régimen vigente [32]; «banda» es el fijo más un filtro que emite «esperar» cuando el ancho q90 − q10 supera su percentil 75 histórico; e «</w:t>
-      </w:r>
-      <w:r>
-        <w:t>híbrido», agregado en esta etapa, combina el umbral rodante con ese filtro de confianza. (3) El método activo se elige por backtesting: solo son admisibles los que actúan entre 10 % y 40 % de las horas y, entre ellos, gana el de mayor ventaja en la mitad m</w:t>
-      </w:r>
-      <w:r>
-        <w:t>ás débil del periodo (criterio maximin [33]) y no el de mayor ventaja promedio, para descartar un método cuyo buen promedio dependa de un solo tramo del año.</w:t>
+        <w:t>Motor de decisión (cuatro métodos y selección por estabilidad).</w:t>
+      </w:r>
+      <w:r>
+        <w:t xml:space="preserve"> (1) Cada método fija un umbral bajo y uno alto y compara con ellos la mediana q50 </w:t>
+      </w:r>
+      <w:r>
+        <w:t>de cada hora: por debajo del bajo el comercializador recibe «comprar» y el generador «retener»; por encima del alto, «evitar compra» y «vender»; en otro caso, «esperar». Los umbrales por defecto son los percentiles 25 y 75, el rango intercuartílico convenc</w:t>
+      </w:r>
+      <w:r>
+        <w:t xml:space="preserve">ional para separar valores típicos de extremos [31]. (2) Los métodos difieren en la referencia: «fijo» usa los </w:t>
+      </w:r>
+      <w:r>
+        <w:lastRenderedPageBreak/>
+        <w:t>percentiles del precio de entrenamiento 2019-2025; «rodante», los de una ventana móvil causal de 30 días sobre q50, que se adapta al régimen vige</w:t>
+      </w:r>
+      <w:r>
+        <w:t>nte [32]; «banda» es el fijo más un filtro que emite «esperar» cuando el ancho q90 − q10 supera su percentil 75 histórico; e «híbrido», agregado en esta etapa, combina el umbral rodante con ese filtro de confianza. (3) El método activo se elige por backtes</w:t>
+      </w:r>
+      <w:r>
+        <w:t>ting: solo son admisibles los que actúan entre 10 % y 40 % de las horas y, entre ellos, gana el de mayor ventaja en la mitad más débil del periodo (criterio maximin [33]) y no el de mayor ventaja promedio, para descartar un método cuyo buen promedio depend</w:t>
+      </w:r>
+      <w:r>
+        <w:t>a de un solo tramo del año.</w:t>
       </w:r>
     </w:p>
     <w:p>
@@ -15452,16 +15502,13 @@
         <w:jc w:val="both"/>
       </w:pPr>
       <w:r>
-        <w:t>La Figura 3 muestra el motor en operación durante una semana de julio de 2026 con el método que el</w:t>
-      </w:r>
-      <w:r>
-        <w:t>ige el criterio de estabilidad para el generador («híbrido»). Cuando la mediana del pronóstico supera el umbral alto, el motor recomienda vender, y cuando cae bajo el umbral bajo, retener; si en esas horas la banda es más ancha que su percentil 75, la conf</w:t>
-      </w:r>
-      <w:r>
-        <w:t>ianza es baja y el motor espera. El 13 de julio, por ejemplo, recomendó vender en horas en que el precio real cayó, un error que proviene del pronóstico y que la banda no alcanzó a señalar. Hoy el motor usa las bandas de N-BEATSx; conectarlo al ensamble de</w:t>
-      </w:r>
-      <w:r>
-        <w:t xml:space="preserve"> seis votantes es trabajo pendiente (Sección 9).</w:t>
+        <w:t>La Figura 3 muestra el motor en operación durante una semana de julio de 2026 con el método que elige el criterio de estabilidad para el generador («híbrido»). Cuando la mediana del pronóstico supera el umbral alto, el motor rec</w:t>
+      </w:r>
+      <w:r>
+        <w:t>omienda vender, y cuando cae bajo el umbral bajo, retener; si en esas horas la banda es más ancha que su percentil 75, la confianza es baja y el motor espera. El 13 de julio, por ejemplo, recomendó vender en horas en que el precio real cayó, un error que p</w:t>
+      </w:r>
+      <w:r>
+        <w:t>roviene del pronóstico y que la banda no alcanzó a señalar. Hoy el motor usa las bandas de N-BEATSx; conectarlo al ensamble de seis votantes es trabajo pendiente (Sección 9).</w:t>
       </w:r>
     </w:p>
     <w:p>
@@ -15474,9 +15521,8 @@
         <w:rPr>
           <w:noProof/>
         </w:rPr>
-        <w:lastRenderedPageBreak/>
         <w:drawing>
-          <wp:inline distT="0" distB="0" distL="0" distR="0" wp14:anchorId="737C3DA4" wp14:editId="0055C015">
+          <wp:inline distT="0" distB="0" distL="0" distR="0" wp14:anchorId="4CD28253" wp14:editId="42DE7CA6">
             <wp:extent cx="4500000" cy="2696229"/>
             <wp:effectExtent l="0" t="0" r="0" b="0"/>
             <wp:docPr id="3" name="Picture 3"/>
@@ -15530,7 +15576,14 @@
           <w:sz w:val="20"/>
           <w:szCs w:val="20"/>
         </w:rPr>
-        <w:t xml:space="preserve"> Motor de decisión en operación, método «híbrido» para el generador (13 al 19 de julio de 2026): pronóstico mediano, banda [q10, q90], umbrales rodantes y acción recomendada en cada hora.</w:t>
+        <w:t xml:space="preserve"> Motor de decisión en operación, método «híbrido» para el generador (1</w:t>
+      </w:r>
+      <w:r>
+        <w:rPr>
+          <w:sz w:val="20"/>
+          <w:szCs w:val="20"/>
+        </w:rPr>
+        <w:t>3 al 19 de julio de 2026): pronóstico mediano, banda [q10, q90], umbrales rodantes y acción recomendada en cada hora.</w:t>
       </w:r>
     </w:p>
     <w:p>
@@ -15542,22 +15595,16 @@
         <w:rPr>
           <w:b/>
         </w:rPr>
-        <w:t>Dashboar</w:t>
-      </w:r>
-      <w:r>
-        <w:rPr>
-          <w:b/>
-        </w:rPr>
-        <w:t>d.</w:t>
-      </w:r>
-      <w:r>
-        <w:t xml:space="preserve"> La vista Operador aplica el método que elige el criterio de estabilidad y muestra, para la hora seleccionada, la acción recomendada, la posición del precio esperado entre los umbrales y un nivel de confianza según el ancho de la banda; la hora se elige </w:t>
-      </w:r>
-      <w:r>
-        <w:t>con un selector o haciendo clic sobre la franja de 24 horas del día. La vista Analista permite fijar a mano el método (incluido «híbrido») y los percentiles, y recalcula el método sugerido sobre el rango de fechas elegido. Ambas vistas se verificaron sin e</w:t>
-      </w:r>
-      <w:r>
-        <w:t>rrores con pruebas automatizadas de Streamlit en las cuatro combinaciones de rol y horizonte.</w:t>
+        <w:t>Dashboard.</w:t>
+      </w:r>
+      <w:r>
+        <w:t xml:space="preserve"> La vista Operador aplica el método que elige el criterio de estabilidad y muestra, para la hora seleccionada, la acción recomen</w:t>
+      </w:r>
+      <w:r>
+        <w:t>dada, la posición del precio esperado entre los umbrales y un nivel de confianza según el ancho de la banda; la hora se elige con un selector o haciendo clic sobre la franja de 24 horas del día. La vista Analista permite fijar a mano el método (incluido «h</w:t>
+      </w:r>
+      <w:r>
+        <w:t>íbrido») y los percentiles, y recalcula el método sugerido sobre el rango de fechas elegido. Ambas vistas se verificaron sin errores con pruebas automatizadas de Streamlit en las cuatro combinaciones de rol y horizonte.</w:t>
       </w:r>
     </w:p>
     <w:p>
@@ -15572,10 +15619,13 @@
         <w:t>Funcionamiento del prototipo.</w:t>
       </w:r>
       <w:r>
-        <w:t xml:space="preserve"> El pipeline se ejecutó de principio a fin: los notebooks 01 a 03 se reejecutaron sin errores (01 y 02 en una copia aislada del proye</w:t>
-      </w:r>
-      <w:r>
-        <w:t>cto), el ensamble se regeneró con los datos corregidos y el dashboard corre localmente con los datos de 2026 (Figura 4). El código completo está en el Anexo 3 y los resultados que demuestran el funcionamiento de cada bloque, en la Sección 7.</w:t>
+        <w:t xml:space="preserve"> El pip</w:t>
+      </w:r>
+      <w:r>
+        <w:t>eline se ejecutó de principio a fin: los notebooks 01 a 03 se reejecutaron sin errores (01 y 02 en una copia aislada del proyecto), el ensamble se regeneró con los datos corregidos y el dashboard corre localmente con los datos de 2026 (Figura 4). El código</w:t>
+      </w:r>
+      <w:r>
+        <w:t xml:space="preserve"> completo está en el Anexo 3 y los resultados que demuestran el funcionamiento de cada bloque, en la Sección 7.</w:t>
       </w:r>
     </w:p>
     <w:p>
@@ -15588,8 +15638,9 @@
         <w:rPr>
           <w:noProof/>
         </w:rPr>
+        <w:lastRenderedPageBreak/>
         <w:drawing>
-          <wp:inline distT="0" distB="0" distL="0" distR="0" wp14:anchorId="74B690B6" wp14:editId="1ADA80F8">
+          <wp:inline distT="0" distB="0" distL="0" distR="0" wp14:anchorId="6C60C59E" wp14:editId="578A2C04">
             <wp:extent cx="3060000" cy="2762500"/>
             <wp:effectExtent l="0" t="0" r="0" b="0"/>
             <wp:docPr id="4" name="Picture 4"/>
@@ -15670,7 +15721,7 @@
       </w:pPr>
       <w:bookmarkStart w:id="97" w:name="_Toc241072132"/>
       <w:bookmarkStart w:id="98" w:name="_Toc241072498"/>
-      <w:bookmarkStart w:id="99" w:name="_Toc241498855"/>
+      <w:bookmarkStart w:id="99" w:name="_Toc241499457"/>
       <w:r>
         <w:t>Pruebas, resultados y análisis de resultados</w:t>
       </w:r>
@@ -15692,7 +15743,7 @@
       <w:bookmarkStart w:id="100" w:name="_Toc240440258"/>
       <w:bookmarkStart w:id="101" w:name="_Toc241072133"/>
       <w:bookmarkStart w:id="102" w:name="_Toc241072499"/>
-      <w:bookmarkStart w:id="103" w:name="_Toc241498856"/>
+      <w:bookmarkStart w:id="103" w:name="_Toc241499458"/>
       <w:r>
         <w:t>Planeación del diseño del experimento</w:t>
       </w:r>
@@ -15713,10 +15764,10 @@
         <w:t>Pregunta técnica.</w:t>
       </w:r>
       <w:r>
-        <w:t xml:space="preserve"> ¿La plataforma pronostica el precio de </w:t>
-      </w:r>
-      <w:r>
-        <w:t>bolsa horario a 24-72 h con un error significativamente menor que la persistencia (rMAE &lt; 1) y con bandas cuya cobertura esté cerca del 80 %?</w:t>
+        <w:t xml:space="preserve"> ¿La plataforma pronostica el precio de bolsa hor</w:t>
+      </w:r>
+      <w:r>
+        <w:t>ario a 24-72 h con un error significativamente menor que la persistencia (rMAE &lt; 1) y con bandas cuya cobertura esté cerca del 80 %?</w:t>
       </w:r>
     </w:p>
     <w:p>
@@ -15779,10 +15830,10 @@
         <w:t>ens</w:t>
       </w:r>
       <w:r>
-        <w:t>| es la diferencia entre el error absoluto de la persistencia y</w:t>
-      </w:r>
-      <w:r>
-        <w:t xml:space="preserve"> el del ensamble. </w:t>
+        <w:t>| es la diferencia entre el error absoluto de la persistencia y el del e</w:t>
+      </w:r>
+      <w:r>
+        <w:t xml:space="preserve">nsamble. </w:t>
       </w:r>
       <w:r>
         <w:rPr>
@@ -15853,10 +15904,10 @@
         <w:t>de una cola</w:t>
       </w:r>
       <w:r>
-        <w:t>, porque la especificación exige superar a la referencia; se aplica a 24 h y a 72 h. Para los modelos individuales en ca</w:t>
-      </w:r>
-      <w:r>
-        <w:t>da origen se usa la de dos colas, para detectar si ganan o pierden.</w:t>
+        <w:t>, porque la especificación exige superar a la referencia; se aplica a 24 h y a 72 h. Para los modelos individuales en cada origen</w:t>
+      </w:r>
+      <w:r>
+        <w:t xml:space="preserve"> se usa la de dos colas, para detectar si ganan o pierden.</w:t>
       </w:r>
     </w:p>
     <w:p>
@@ -15889,10 +15940,10 @@
         <w:t>t</w:t>
       </w:r>
       <w:r>
-        <w:t>| (COP/kWh), resumido en MAE, RMSE, MAPE y sMAPE. Los factores son: modelo (7 niveles: seis votantes y ensamble), ho</w:t>
-      </w:r>
-      <w:r>
-        <w:t xml:space="preserve">rizonte (3 tramos de 24 h), origen temporal (6 regímenes ENSO), pesos del combinador (validación cruzada con 10 particiones o versión desplegable causal) y hora de lanzamiento (00:00 o 23:00). El método es una </w:t>
+        <w:t>| (COP/kWh), resumido en MAE, RMSE, MAPE y sMAPE. Los factores son: modelo (7 niveles: seis votantes y ensamble), horizonte (</w:t>
+      </w:r>
+      <w:r>
+        <w:t xml:space="preserve">3 tramos de 24 h), origen temporal (6 regímenes ENSO), pesos del combinador (validación cruzada con 10 particiones o versión desplegable causal) y hora de lanzamiento (00:00 o 23:00). El método es una </w:t>
       </w:r>
       <w:r>
         <w:rPr>
@@ -15901,10 +15952,10 @@
         <w:t>evaluación fuera de muestra con origen móvil</w:t>
       </w:r>
       <w:r>
-        <w:t xml:space="preserve"> (</w:t>
-      </w:r>
-      <w:r>
-        <w:t>walk-forward) [19] con comparaciones pareadas hora a hora.</w:t>
+        <w:t xml:space="preserve"> (walk-forw</w:t>
+      </w:r>
+      <w:r>
+        <w:t>ard) [19] con comparaciones pareadas hora a hora.</w:t>
       </w:r>
     </w:p>
     <w:p>
@@ -15924,7 +15975,7 @@
       <w:bookmarkStart w:id="104" w:name="_Toc240440261"/>
       <w:bookmarkStart w:id="105" w:name="_Toc241072136"/>
       <w:bookmarkStart w:id="106" w:name="_Toc241072500"/>
-      <w:bookmarkStart w:id="107" w:name="_Toc241498857"/>
+      <w:bookmarkStart w:id="107" w:name="_Toc241499459"/>
       <w:r>
         <w:t>Instrumentación y validación</w:t>
       </w:r>
@@ -15945,10 +15996,10 @@
         <w:t>Instrumento:</w:t>
       </w:r>
       <w:r>
-        <w:t xml:space="preserve"> la serie oficial de precio de XM [4], horaria y con hasta cinco decimales en COP/kWh; su error es despreciable frente a los de pronóstico. Equipo: AMD Ryz</w:t>
-      </w:r>
-      <w:r>
-        <w:t xml:space="preserve">en 7 7730U, 15,4 GB de RAM, sin GPU. </w:t>
+        <w:t xml:space="preserve"> la serie oficial de precio de XM [4], horaria y con hasta cinco decimales en COP/kWh; su error es despreciable frente a los de pronóstico. Equipo: AMD Ryzen 7 7730</w:t>
+      </w:r>
+      <w:r>
+        <w:t xml:space="preserve">U, 15,4 GB de RAM, sin GPU. </w:t>
       </w:r>
       <w:r>
         <w:rPr>
@@ -15957,7 +16008,11 @@
         <w:t>Repeticiones:</w:t>
       </w:r>
       <w:r>
-        <w:t xml:space="preserve"> 5.184 pares hora a hora en 2026 (216 días), muy por encima de 30; la autocorrelación se corrige con la varianza de Newey-West [34]. El walk-forward suma seis orígenes de 5.184 a 8.784 horas, y la combinación se repitió con 10 particiones. </w:t>
+        <w:t xml:space="preserve"> 5.184 pares hora a hora en 2026 (216 días), muy por encima de 30; la autocorrelación se </w:t>
+      </w:r>
+      <w:r>
+        <w:lastRenderedPageBreak/>
+        <w:t xml:space="preserve">corrige con la varianza de Newey-West [34]. El walk-forward suma seis orígenes de 5.184 a 8.784 horas, y la combinación se repitió con 10 particiones. </w:t>
       </w:r>
       <w:r>
         <w:rPr>
@@ -16041,7 +16096,7 @@
       <w:bookmarkStart w:id="108" w:name="_Toc240440262"/>
       <w:bookmarkStart w:id="109" w:name="_Toc241072137"/>
       <w:bookmarkStart w:id="110" w:name="_Toc241072501"/>
-      <w:bookmarkStart w:id="111" w:name="_Toc241498858"/>
+      <w:bookmarkStart w:id="111" w:name="_Toc241499460"/>
       <w:r>
         <w:t>Marco normativo de las pruebas</w:t>
       </w:r>
@@ -16078,9 +16133,8 @@
       <w:bookmarkStart w:id="112" w:name="_Toc240440263"/>
       <w:bookmarkStart w:id="113" w:name="_Toc241072138"/>
       <w:bookmarkStart w:id="114" w:name="_Toc241072502"/>
-      <w:bookmarkStart w:id="115" w:name="_Toc241498859"/>
-      <w:r>
-        <w:lastRenderedPageBreak/>
+      <w:bookmarkStart w:id="115" w:name="_Toc241499461"/>
+      <w:r>
         <w:t>Ejecución del plan experimental</w:t>
       </w:r>
       <w:bookmarkEnd w:id="112"/>
@@ -18085,8 +18139,9 @@
       <w:bookmarkStart w:id="116" w:name="_Toc240440264"/>
       <w:bookmarkStart w:id="117" w:name="_Toc241072139"/>
       <w:bookmarkStart w:id="118" w:name="_Toc241072503"/>
-      <w:bookmarkStart w:id="119" w:name="_Toc241498860"/>
-      <w:r>
+      <w:bookmarkStart w:id="119" w:name="_Toc241499462"/>
+      <w:r>
+        <w:lastRenderedPageBreak/>
         <w:t>Resultados</w:t>
       </w:r>
       <w:bookmarkEnd w:id="116"/>
@@ -18128,9 +18183,8 @@
         <w:rPr>
           <w:noProof/>
         </w:rPr>
-        <w:lastRenderedPageBreak/>
         <w:drawing>
-          <wp:inline distT="0" distB="0" distL="0" distR="0" wp14:anchorId="4B926CB4" wp14:editId="4B612196">
+          <wp:inline distT="0" distB="0" distL="0" distR="0" wp14:anchorId="6AC78BC3" wp14:editId="0449B0C7">
             <wp:extent cx="4140000" cy="1776493"/>
             <wp:effectExtent l="0" t="0" r="0" b="0"/>
             <wp:docPr id="5" name="Picture 5"/>
@@ -19740,6 +19794,40 @@
         <w:rPr>
           <w:b/>
         </w:rPr>
+        <w:t>Error diario e intervalos de confianza.</w:t>
+      </w:r>
+      <w:r>
+        <w:t xml:space="preserve"> El MAE de 40,97 COP/kWh es un promedio de 216 días con comportamientos muy distintos, por lo que también se analizó el error de cada día. El MAE diario del ensamble tiene media 4</w:t>
+      </w:r>
+      <w:r>
+        <w:t>0,97 COP/kWh y desviación estándar 35,59. Como los días de error alto vienen en rachas (autocorrelación de 0,67 entre días consecutivos), el intervalo de confianza del 95 % para la media se calculó con bootstrap por bloques de 7 días: [31,1; 50,8] COP/kWh,</w:t>
+      </w:r>
+      <w:r>
+        <w:t xml:space="preserve"> frente a [43,1; 68,9] de la persistencia. En el 80 % de los días el MAE del ensamble estuvo entre 3,7 y 91,8 COP/kWh; fue menor que 50 COP/kWh en el 69,4 % de los días (58,3 % para la persistencia) y menor que 100 en el 92,1 % (83,3 %). En términos relati</w:t>
+      </w:r>
+      <w:r>
+        <w:t xml:space="preserve">vos, el MAPE diario tiene media 10,45 % con intervalo [8,6 %; 12,4 %], y en el 90 % de los días queda por debajo de 21,4 %. La diferencia diaria de MAE entre la persistencia y el ensamble tiene </w:t>
+      </w:r>
+      <w:r>
+        <w:lastRenderedPageBreak/>
+        <w:t>media 15,4 COP/kWh, con un intervalo [10,5; 19,9] que no inclu</w:t>
+      </w:r>
+      <w:r>
+        <w:t>ye el cero, y el ensamble tuvo menor error en el 71,8 % de los días, un resultado coherente con la prueba de Diebold-Mariano. Por último, el error medio con signo es de +4,6 COP/kWh [0,6; 9,8]: el ensamble subestima levemente el precio, en cerca del 1 % de</w:t>
+      </w:r>
+      <w:r>
+        <w:t>l precio medio de 2026.</w:t>
+      </w:r>
+    </w:p>
+    <w:p>
+      <w:pPr>
+        <w:spacing w:after="100"/>
+        <w:jc w:val="both"/>
+      </w:pPr>
+      <w:r>
+        <w:rPr>
+          <w:b/>
+        </w:rPr>
         <w:t>Robustez entre regímenes.</w:t>
       </w:r>
       <w:r>
@@ -19765,14 +19853,14 @@
           <w:sz w:val="20"/>
           <w:szCs w:val="20"/>
         </w:rPr>
-        <w:t xml:space="preserve"> MAE (COP/kWh) por origen walk-f</w:t>
+        <w:t xml:space="preserve"> MAE (COP/kWh) por origen walk-forward y resul</w:t>
       </w:r>
       <w:r>
         <w:rPr>
           <w:sz w:val="20"/>
           <w:szCs w:val="20"/>
         </w:rPr>
-        <w:t>orward y resultado de Diebold-Mariano frente a la persistencia.</w:t>
+        <w:t>tado de Diebold-Mariano frente a la persistencia.</w:t>
       </w:r>
     </w:p>
     <w:tbl>
@@ -21169,7 +21257,6 @@
           <w:sz w:val="20"/>
           <w:szCs w:val="20"/>
         </w:rPr>
-        <w:lastRenderedPageBreak/>
         <w:t>Tabla 16.</w:t>
       </w:r>
       <w:r>
@@ -23087,7 +23174,11 @@
         <w:t>6, 281,6, 299,7 y 279,5 COP/kWh). Al evaluar por separado las dos mitades del periodo (corte: 19 de abril) ese resultado no se sostiene: para el generador a 24 h, «banda» actúa en el 1,2 % de las horas de la primera mitad y en el 32,6 % de la segunda, y pa</w:t>
       </w:r>
       <w:r>
-        <w:t>ra el comercializador no actúa en ninguna hora de la segunda mitad (Tabla 19, Figura 6). La causa es la referencia fija: el precio de 2026 se alejó del rango 2019-2025, de modo que casi todas las horas quedan por encima o por debajo de los percentiles hist</w:t>
+        <w:t xml:space="preserve">ra el comercializador no actúa en ninguna hora de la segunda mitad (Tabla 19, Figura 6). La causa es la </w:t>
+      </w:r>
+      <w:r>
+        <w:lastRenderedPageBreak/>
+        <w:t>referencia fija: el precio de 2026 se alejó del rango 2019-2025, de modo que casi todas las horas quedan por encima o por debajo de los percentiles hist</w:t>
       </w:r>
       <w:r>
         <w:t>óricos. Con el criterio de estabilidad el motor elige «híbrido» para el generador y «rodante» para el comercializador en ambos horizontes, los únicos métodos con ventaja positiva y frecuencia válida en las dos mitades (Tabla 18). Su ventaja promedio es men</w:t>
@@ -24237,7 +24328,6 @@
                 <w:sz w:val="17"/>
                 <w:szCs w:val="17"/>
               </w:rPr>
-              <w:lastRenderedPageBreak/>
               <w:t>generador</w:t>
             </w:r>
           </w:p>
@@ -25428,7 +25518,7 @@
           <w:noProof/>
         </w:rPr>
         <w:drawing>
-          <wp:inline distT="0" distB="0" distL="0" distR="0" wp14:anchorId="68525C6B" wp14:editId="3AB06869">
+          <wp:inline distT="0" distB="0" distL="0" distR="0" wp14:anchorId="1A0F7C5D" wp14:editId="5F22CCDB">
             <wp:extent cx="4482000" cy="1859524"/>
             <wp:effectExtent l="0" t="0" r="0" b="0"/>
             <wp:docPr id="6" name="Picture 6"/>
@@ -25506,6 +25596,7 @@
         <w:t xml:space="preserve">/75 queda en un punto intermedio (313,3 COP/kWh, 37,6 % de las horas), y para el comercializador la ventaja casi no cambia con el par elegido (272,7 a 286,4 COP/kWh). En el barrido documentado en la bitácora también se probaron ventanas rodantes de 7 a 90 </w:t>
       </w:r>
       <w:r>
+        <w:lastRenderedPageBreak/>
         <w:t>días y percentiles del filtro de ancho de 60 a 90: la ventana de 30 días fue más pareja entre mitades que la de 90, y el filtro mostró una curva plana alrededor de 75, por lo que se conservaron los valores por defecto.</w:t>
       </w:r>
     </w:p>
@@ -25520,7 +25611,7 @@
           <w:noProof/>
         </w:rPr>
         <w:drawing>
-          <wp:inline distT="0" distB="0" distL="0" distR="0" wp14:anchorId="1CA2616F" wp14:editId="1C809846">
+          <wp:inline distT="0" distB="0" distL="0" distR="0" wp14:anchorId="5519DBED" wp14:editId="5C17024A">
             <wp:extent cx="4482000" cy="1859524"/>
             <wp:effectExtent l="0" t="0" r="0" b="0"/>
             <wp:docPr id="7" name="Picture 7"/>
@@ -25586,7 +25677,6 @@
         <w:rPr>
           <w:b/>
         </w:rPr>
-        <w:lastRenderedPageBreak/>
         <w:t>Último mes y traducción a pesos.</w:t>
       </w:r>
       <w:r>
@@ -25616,7 +25706,7 @@
           <w:noProof/>
         </w:rPr>
         <w:drawing>
-          <wp:inline distT="0" distB="0" distL="0" distR="0" wp14:anchorId="0C5E6AB5" wp14:editId="1D305ADA">
+          <wp:inline distT="0" distB="0" distL="0" distR="0" wp14:anchorId="79BFC000" wp14:editId="4C35A826">
             <wp:extent cx="4482000" cy="1859524"/>
             <wp:effectExtent l="0" t="0" r="0" b="0"/>
             <wp:docPr id="8" name="Picture 8"/>
@@ -25686,7 +25776,7 @@
       <w:bookmarkStart w:id="120" w:name="_Toc240440265"/>
       <w:bookmarkStart w:id="121" w:name="_Toc241072140"/>
       <w:bookmarkStart w:id="122" w:name="_Toc241072504"/>
-      <w:bookmarkStart w:id="123" w:name="_Toc241498861"/>
+      <w:bookmarkStart w:id="123" w:name="_Toc241499463"/>
       <w:r>
         <w:t>Análisis e interpretación de resultados</w:t>
       </w:r>
@@ -25753,10 +25843,7 @@
         <w:t xml:space="preserve"> en los tres casos</w:t>
       </w:r>
       <w:r>
-        <w:t>: el ensamble es significativamente más preciso</w:t>
-      </w:r>
-      <w:r>
-        <w:t xml:space="preserve"> que la persistencia.</w:t>
+        <w:t>: el ensamble es significativamente más preciso que la persistencia.</w:t>
       </w:r>
     </w:p>
     <w:p>
@@ -25768,16 +25855,17 @@
         <w:rPr>
           <w:b/>
         </w:rPr>
+        <w:lastRenderedPageBreak/>
         <w:t>Lectura honesta de la robustez.</w:t>
       </w:r>
       <w:r>
-        <w:t xml:space="preserve"> En los orígenes históricos 1 a 5 ningún modelo individual supera de forma consistente a la persistencia: N-BEATSx no le gana en ninguno, pierde en el O1 y empata en los demás (MAE medio 50,83 frente a 48,50), y XGBoost pierde en los seis. El ensamble comp</w:t>
-      </w:r>
-      <w:r>
-        <w:t xml:space="preserve">leto solo puede evaluarse en 2026; extenderlo a los orígenes 1-5 es trabajo pendiente. Además, las redes usan un corte a las 00:00, cuando ya se conoce la primera hora del día de despacho; con el pronóstico lanzado a las 23:00 el ensamble sube a MAE 51,90 </w:t>
-      </w:r>
-      <w:r>
-        <w:t>(MAPE 14,21 %; cálculo previo a la corrección de la demanda, que afecta 48 de 5.184 horas), aún mejor que la persistencia (56,40).</w:t>
+        <w:t xml:space="preserve"> En los orígenes históricos 1 a 5 ningún modelo individual supera de forma consistente a la persistencia: N-BEATSx no le gana en ninguno, pierde en el O1 y </w:t>
+      </w:r>
+      <w:r>
+        <w:t>empata en los demás (MAE medio 50,83 frente a 48,50), y XGBoost pierde en los seis. El ensamble completo solo puede evaluarse en 2026; extenderlo a los orígenes 1-5 es trabajo pendiente. Además, las redes usan un corte a las 00:00, cuando ya se conoce la p</w:t>
+      </w:r>
+      <w:r>
+        <w:t>rimera hora del día de despacho; con el pronóstico lanzado a las 23:00 el ensamble sube a MAE 51,90 (MAPE 14,21 %; cálculo previo a la corrección de la demanda, que afecta 48 de 5.184 horas), aún mejor que la persistencia (56,40).</w:t>
       </w:r>
     </w:p>
     <w:p>
@@ -25789,16 +25877,19 @@
         <w:rPr>
           <w:b/>
         </w:rPr>
-        <w:t>Validación externa (Tabla 4).</w:t>
-      </w:r>
-      <w:r>
-        <w:t xml:space="preserve"> El MAPE es mayor que el del antecedente colombiano horario [15] (10,45 % frente a 6,7 %), pero </w:t>
-      </w:r>
-      <w:r>
-        <w:t>ese trabajo evaluó 2000-2017, sin los eventos extremos de 2023-2026 y con un modelo univariado. Frente a Nueva Zelanda [16], el MASE es menor que 1 mientras ninguno de sus 33 modelos baja de 1,26; como ellos pronostican precio diario transformado con Box-C</w:t>
-      </w:r>
-      <w:r>
-        <w:t>ox, se lee como «superar al propio ingenuo en una tarea más difícil», no como comparación numérica directa.</w:t>
+        <w:t>Validación externa (Tabla</w:t>
+      </w:r>
+      <w:r>
+        <w:rPr>
+          <w:b/>
+        </w:rPr>
+        <w:t xml:space="preserve"> 4).</w:t>
+      </w:r>
+      <w:r>
+        <w:t xml:space="preserve"> El MAPE es mayor que el del antecedente colombiano horario [15] (10,45 % frente a 6,7 %), pero ese trabajo evaluó 2000-2017, sin los eventos extremos de 2023-2026 y con un modelo univariado. Frente a Nueva Zelanda [16], el MASE es menor que 1 mientras</w:t>
+      </w:r>
+      <w:r>
+        <w:t xml:space="preserve"> ninguno de sus 33 modelos baja de 1,26; como ellos pronostican precio diario transformado con Box-Cox, se lee como «superar al propio ingenuo en una tarea más difícil», no como comparación numérica directa.</w:t>
       </w:r>
     </w:p>
     <w:p>
@@ -25813,14 +25904,13 @@
         <w:t>Interpretabilidad (criterio de OE2).</w:t>
       </w:r>
       <w:r>
-        <w:t xml:space="preserve"> SHAP [27] y permutación sobre XGBoost coinciden en las tres variables más importantes (precio rezagado 24 h, me</w:t>
-      </w:r>
-      <w:r>
-        <w:t xml:space="preserve">dia de 24 h y precio rezagado 168 h; correlación de Spearman </w:t>
-      </w:r>
-      <w:r>
-        <w:lastRenderedPageBreak/>
-        <w:t>entre ambos rankings de 0,811), evidencia cruzada de que el modelo se apoya en las variables que la caracterización de OE1 ya señalaba como dominantes.</w:t>
+        <w:t xml:space="preserve"> SHAP [27] y</w:t>
+      </w:r>
+      <w:r>
+        <w:t xml:space="preserve"> permutación sobre XGBoost coinciden en las tres variables más importantes (precio rezagado 24 h, media de 24 h y precio rezagado 168 h; correlación de Spearman entre ambos rankings de 0,811), evidencia cruzada de que el modelo se apoya en las variables qu</w:t>
+      </w:r>
+      <w:r>
+        <w:t>e la caracterización de OE1 ya señalaba como dominantes.</w:t>
       </w:r>
     </w:p>
     <w:p>
@@ -25836,7 +25926,7 @@
       <w:bookmarkStart w:id="124" w:name="_Toc241072141"/>
       <w:bookmarkStart w:id="125" w:name="_Toc241072505"/>
       <w:bookmarkStart w:id="126" w:name="_Toc240440266"/>
-      <w:bookmarkStart w:id="127" w:name="_Toc241498862"/>
+      <w:bookmarkStart w:id="127" w:name="_Toc241499464"/>
       <w:r>
         <w:t>Análisis de impacto del proyecto</w:t>
       </w:r>
@@ -25858,7 +25948,7 @@
         </w:numPr>
         <w:spacing w:before="300"/>
       </w:pPr>
-      <w:bookmarkStart w:id="128" w:name="_Toc241498863"/>
+      <w:bookmarkStart w:id="128" w:name="_Toc241499465"/>
       <w:r>
         <w:t>Impacto social</w:t>
       </w:r>
@@ -25870,10 +25960,10 @@
         <w:jc w:val="both"/>
       </w:pPr>
       <w:r>
-        <w:t>Empresas medianas sin equipos de analítica acceden a un pronóstico con su incertidumbre y a una recomendación en lenguaje simple. Para evitar la dependencia de la recomendación, el dashboard muestra siempre el nivel de confianza y aclara que no es as</w:t>
-      </w:r>
-      <w:r>
-        <w:t>esoría financiera [2].</w:t>
+        <w:t>Empresas medianas sin equipos de analítica acceden a un pronóstico con su incertidumbre y a una recomendación en lenguaje simple. Para evitar la depen</w:t>
+      </w:r>
+      <w:r>
+        <w:t>dencia de la recomendación, el dashboard muestra siempre el nivel de confianza y aclara que no es asesoría financiera [2].</w:t>
       </w:r>
     </w:p>
     <w:p>
@@ -25886,7 +25976,7 @@
         </w:numPr>
         <w:spacing w:before="300"/>
       </w:pPr>
-      <w:bookmarkStart w:id="129" w:name="_Toc241498864"/>
+      <w:bookmarkStart w:id="129" w:name="_Toc241499466"/>
       <w:r>
         <w:t>Impacto ambiental</w:t>
       </w:r>
@@ -25898,10 +25988,10 @@
         <w:jc w:val="both"/>
       </w:pPr>
       <w:r>
-        <w:t xml:space="preserve">Reentrenar el ensamble de 24 h toma 7,2 minutos en un portátil sin GPU (unas milésimas de kWh con un consumo de unos 25 W), despreciable frente a entrenar en centros de datos. Una mejor planeación de compra y venta </w:t>
-      </w:r>
-      <w:r>
-        <w:t>puede favorecer un uso más eficiente del recurso hídrico en épocas secas.</w:t>
+        <w:t>Reentrenar el ensamble de 24 h toma 7,2 minutos en un portátil sin GPU (unas milésimas de kWh con un consumo de uno</w:t>
+      </w:r>
+      <w:r>
+        <w:t>s 25 W), despreciable frente a entrenar en centros de datos. Una mejor planeación de compra y venta puede favorecer un uso más eficiente del recurso hídrico en épocas secas.</w:t>
       </w:r>
     </w:p>
     <w:p>
@@ -25914,7 +26004,7 @@
         </w:numPr>
         <w:spacing w:before="300"/>
       </w:pPr>
-      <w:bookmarkStart w:id="130" w:name="_Toc241498865"/>
+      <w:bookmarkStart w:id="130" w:name="_Toc241499467"/>
       <w:r>
         <w:t>Impacto legal y regulatorio</w:t>
       </w:r>
@@ -25926,10 +26016,10 @@
         <w:jc w:val="both"/>
       </w:pPr>
       <w:r>
-        <w:t xml:space="preserve">Solo se usa información pública de XM/SIMEM [21], no se recolectan datos personales [22] y no se ejecutan transacciones. Ante intervenciones transitorias </w:t>
-      </w:r>
-      <w:r>
-        <w:t>de la CREG en la formación del precio, cada modelo documenta su fecha de corte y el pipeline permite reentrenar rápidamente.</w:t>
+        <w:t>Solo se usa información pública de XM/SIMEM [21], no s</w:t>
+      </w:r>
+      <w:r>
+        <w:t>e recolectan datos personales [22] y no se ejecutan transacciones. Ante intervenciones transitorias de la CREG en la formación del precio, cada modelo documenta su fecha de corte y el pipeline permite reentrenar rápidamente.</w:t>
       </w:r>
     </w:p>
     <w:p>
@@ -25942,7 +26032,7 @@
         </w:numPr>
         <w:spacing w:before="300"/>
       </w:pPr>
-      <w:bookmarkStart w:id="131" w:name="_Toc241498866"/>
+      <w:bookmarkStart w:id="131" w:name="_Toc241499468"/>
       <w:r>
         <w:t>Impacto económico y financiero</w:t>
       </w:r>
@@ -25954,13 +26044,13 @@
         <w:jc w:val="both"/>
       </w:pPr>
       <w:r>
-        <w:t>El costo del proyecto es de $37.605.260 (Tabla 1), casi todo en horas de personal. En el backtesting</w:t>
-      </w:r>
-      <w:r>
-        <w:t xml:space="preserve"> de 2026 a 24 h, con el método que elige el criterio de estabilidad, las horas en que el motor recomienda vender tuvieron un precio medio 166,8 COP/kWh por encima del promedio, y las de comprar, 169,6 COP/kWh por debajo. Para un cliente de ejemplo de 100 k</w:t>
-      </w:r>
-      <w:r>
-        <w:t>W, en el último mes evaluado esto equivale a +1,06 millones de COP con «híbrido», frente a −0,65 millones con «banda». No es una ganancia garantizada: no modela contratos, capacidad ni costos de transacción.</w:t>
+        <w:t xml:space="preserve">El costo del proyecto es de $37.605.260 (Tabla 1), casi todo en horas de personal. En el backtesting de 2026 a 24 h, con el método que elige el criterio de estabilidad, las horas en que el motor recomienda vender tuvieron un precio medio 166,8 COP/kWh por </w:t>
+      </w:r>
+      <w:r>
+        <w:t>encima del promedio, y las de comprar, 169,6 COP/kWh por debajo. Para un cliente de ejemplo de 100 kW, en el último mes evaluado esto equivale a +1,06 millones de COP con «híbrido», frente a −0,65 millones con «banda». No es una ganancia garantizada: no mo</w:t>
+      </w:r>
+      <w:r>
+        <w:t>dela contratos, capacidad ni costos de transacción.</w:t>
       </w:r>
     </w:p>
     <w:p>
@@ -25976,8 +26066,9 @@
       <w:bookmarkStart w:id="132" w:name="_Toc240440267"/>
       <w:bookmarkStart w:id="133" w:name="_Toc241072142"/>
       <w:bookmarkStart w:id="134" w:name="_Toc241072506"/>
-      <w:bookmarkStart w:id="135" w:name="_Toc241498867"/>
-      <w:r>
+      <w:bookmarkStart w:id="135" w:name="_Toc241499469"/>
+      <w:r>
+        <w:lastRenderedPageBreak/>
         <w:t>Conclusiones y recomendaciones</w:t>
       </w:r>
       <w:bookmarkEnd w:id="132"/>
@@ -25991,13 +26082,13 @@
         <w:jc w:val="both"/>
       </w:pPr>
       <w:r>
-        <w:t>El primer objetiv</w:t>
-      </w:r>
-      <w:r>
-        <w:t>o específico está cumplido (100 %). Se sincronizaron a resolución horaria las cinco variables del mercado y el ONI entre enero de 2019 y agosto de 2026, en 66.576 horas sin huecos. La caracterización identificó la componente de 24 h como dominante, con arm</w:t>
-      </w:r>
-      <w:r>
-        <w:t>ónicos de 12 y 168 h, y esos resultados definieron las 40 variables predictoras; además, el filtro de Savitzky-Golay detecta los cambios de régimen 376 h antes que el promedio móvil.</w:t>
+        <w:t xml:space="preserve">El primer objetivo específico está cumplido (100 %). Se sincronizaron a resolución horaria las cinco variables del mercado y el ONI entre enero de 2019 y agosto de 2026, en </w:t>
+      </w:r>
+      <w:r>
+        <w:t>66.576 horas sin huecos. La caracterización identificó la componente de 24 h como dominante, con armónicos de 12 y 168 h, y esos resultados definieron las 40 variables predictoras; además, el filtro de Savitzky-Golay detecta los cambios de régimen 376 h an</w:t>
+      </w:r>
+      <w:r>
+        <w:t>tes que el promedio móvil.</w:t>
       </w:r>
     </w:p>
     <w:p>
@@ -26006,13 +26097,10 @@
         <w:jc w:val="both"/>
       </w:pPr>
       <w:r>
-        <w:t>El segundo objetivo está cumplido en lo técnico y en consolidación (90 %)</w:t>
-      </w:r>
-      <w:r>
-        <w:t>. Se compararon seis modelos de familias distintas y nueve descartados, y el ensamble reduce el error absoluto medio en 27 % frente a la persistencia a 24 h (40,97 frente a 56,40 COP/kWh) y en 23 % a 72 h, con significancia estadística. Para cerrarlo falta</w:t>
-      </w:r>
-      <w:r>
-        <w:t xml:space="preserve"> validar el ensamble completo en los orígenes históricos 1 a 5.</w:t>
+        <w:t>El segundo objetivo está cumplido en lo técnico y en consolidación (90 %). Se compararon seis modelos de familias distintas y nueve descartados, y el ensamble reduce el error absoluto medio en 27 % frente a la persistencia a 24 h</w:t>
+      </w:r>
+      <w:r>
+        <w:t xml:space="preserve"> (40,97 frente a 56,40 COP/kWh) y en 23 % a 72 h, con significancia estadística. Para cerrarlo falta validar el ensamble completo en los orígenes históricos 1 a 5.</w:t>
       </w:r>
     </w:p>
     <w:p>
@@ -26024,11 +26112,7 @@
         <w:t xml:space="preserve">El tercer objetivo está en ejecución (70 %). El motor traduce las bandas en señales de comprar, vender o esperar para dos roles y dos horizontes con cuatro métodos, y elige el método activo por un criterio de estabilidad entre las dos mitades del periodo; </w:t>
       </w:r>
       <w:r>
-        <w:t xml:space="preserve">el dashboard funciona y se verificó con pruebas </w:t>
-      </w:r>
-      <w:r>
-        <w:lastRenderedPageBreak/>
-        <w:t>automatizadas. Faltan la biblioteca de imágenes, conectar el motor al ensamble de seis votantes, que hoy usa las bandas de N-BEATSx, e integrar métricas de decisión basadas en la forma del día [8].</w:t>
+        <w:t>el dashboard funciona y se verificó con pruebas automatizadas. Faltan la biblioteca de imágenes, conectar el motor al ensamble de seis votantes, que hoy usa las bandas de N-BEATSx, e integrar métricas de decisión basadas en la forma del día [8].</w:t>
       </w:r>
     </w:p>
     <w:p>
@@ -26080,7 +26164,7 @@
       <w:bookmarkStart w:id="136" w:name="_Toc240440268"/>
       <w:bookmarkStart w:id="137" w:name="_Toc241072143"/>
       <w:bookmarkStart w:id="138" w:name="_Toc241072507"/>
-      <w:bookmarkStart w:id="139" w:name="_Toc241498868"/>
+      <w:bookmarkStart w:id="139" w:name="_Toc241499470"/>
       <w:r>
         <w:t>Bibliografía (formato IEEE)</w:t>
       </w:r>
@@ -26256,6 +26340,7 @@
           <w:sz w:val="20"/>
           <w:szCs w:val="20"/>
         </w:rPr>
+        <w:lastRenderedPageBreak/>
         <w:t>[6]</w:t>
       </w:r>
       <w:r>
@@ -26485,7 +26570,6 @@
           <w:sz w:val="20"/>
           <w:szCs w:val="20"/>
         </w:rPr>
-        <w:lastRenderedPageBreak/>
         <w:t>[12]</w:t>
       </w:r>
       <w:r>
@@ -26623,14 +26707,7 @@
           <w:szCs w:val="20"/>
         </w:rPr>
         <w:tab/>
-        <w:t>S. Gallón y J. Barrientos, "Forecasting the Colombian electricity spo</w:t>
-      </w:r>
-      <w:r>
-        <w:rPr>
-          <w:sz w:val="20"/>
-          <w:szCs w:val="20"/>
-        </w:rPr>
-        <w:t xml:space="preserve">t price under a functional approach," </w:t>
+        <w:t xml:space="preserve">S. Gallón y J. Barrientos, "Forecasting the Colombian electricity spot price under a functional approach," </w:t>
       </w:r>
       <w:r>
         <w:rPr>
@@ -26666,7 +26743,14 @@
           <w:szCs w:val="20"/>
         </w:rPr>
         <w:tab/>
-        <w:t xml:space="preserve">G. Kapoor y N. Wichitaksorn, "Electricity price forecasting in New Zealand: A comparative analysis of statistical and machine learning models with feature selection," </w:t>
+        <w:t>G. Kapoor y N. Wichitaksorn, "Electricity price fo</w:t>
+      </w:r>
+      <w:r>
+        <w:rPr>
+          <w:sz w:val="20"/>
+          <w:szCs w:val="20"/>
+        </w:rPr>
+        <w:t xml:space="preserve">recasting in New Zealand: A comparative analysis of statistical and machine learning models with feature selection," </w:t>
       </w:r>
       <w:r>
         <w:rPr>
@@ -26702,7 +26786,14 @@
           <w:szCs w:val="20"/>
         </w:rPr>
         <w:tab/>
-        <w:t xml:space="preserve">F. Ziel y R. Weron, "Day-ahead electricity price forecasting with high-dimensional structures: Univariate vs. multivariate modeling frameworks," </w:t>
+        <w:t>F. Ziel y R. Weron, "Day-ahead electricity price forec</w:t>
+      </w:r>
+      <w:r>
+        <w:rPr>
+          <w:sz w:val="20"/>
+          <w:szCs w:val="20"/>
+        </w:rPr>
+        <w:t xml:space="preserve">asting with high-dimensional structures: Univariate vs. multivariate modeling frameworks," </w:t>
       </w:r>
       <w:r>
         <w:rPr>
@@ -26738,14 +26829,7 @@
           <w:szCs w:val="20"/>
         </w:rPr>
         <w:tab/>
-        <w:t xml:space="preserve">Y. Romano, E. Patterson y E. </w:t>
-      </w:r>
-      <w:r>
-        <w:rPr>
-          <w:sz w:val="20"/>
-          <w:szCs w:val="20"/>
-        </w:rPr>
-        <w:t xml:space="preserve">Candès, "Conformalized quantile regression," en </w:t>
+        <w:t xml:space="preserve">Y. Romano, E. Patterson y E. Candès, "Conformalized quantile regression," en </w:t>
       </w:r>
       <w:r>
         <w:rPr>
@@ -26753,35 +26837,7 @@
           <w:sz w:val="20"/>
           <w:szCs w:val="20"/>
         </w:rPr>
-        <w:t>Adv. Neural Inf. Process. Syst. 32 (NeurIPS 2019)</w:t>
-      </w:r>
-      <w:r>
-        <w:rPr>
-          <w:sz w:val="20"/>
-          <w:szCs w:val="20"/>
-        </w:rPr>
-        <w:t>, Vancouver, Canadá, 2019.</w:t>
-      </w:r>
-    </w:p>
-    <w:p>
-      <w:pPr>
-        <w:spacing w:after="80"/>
-        <w:ind w:left="567" w:hanging="567"/>
-      </w:pPr>
-      <w:r>
-        <w:rPr>
-          <w:sz w:val="20"/>
-          <w:szCs w:val="20"/>
-        </w:rPr>
-        <w:t>[19]</w:t>
-      </w:r>
-      <w:r>
-        <w:rPr>
-          <w:sz w:val="20"/>
-          <w:szCs w:val="20"/>
-        </w:rPr>
-        <w:tab/>
-        <w:t xml:space="preserve">L. J. Tashman, "Out-of-sample tests of forecasting accuracy: An analysis and review," </w:t>
+        <w:t>Adv. Ne</w:t>
       </w:r>
       <w:r>
         <w:rPr>
@@ -26789,42 +26845,35 @@
           <w:sz w:val="20"/>
           <w:szCs w:val="20"/>
         </w:rPr>
-        <w:t>Int. J. Forecast.</w:t>
+        <w:t>ural Inf. Process. Syst. 32 (NeurIPS 2019)</w:t>
       </w:r>
       <w:r>
         <w:rPr>
           <w:sz w:val="20"/>
           <w:szCs w:val="20"/>
         </w:rPr>
-        <w:t>, vol. 16, no. 4, pp. 43</w:t>
-      </w:r>
+        <w:t>, Vancouver, Canadá, 2019.</w:t>
+      </w:r>
+    </w:p>
+    <w:p>
+      <w:pPr>
+        <w:spacing w:after="80"/>
+        <w:ind w:left="567" w:hanging="567"/>
+      </w:pPr>
       <w:r>
         <w:rPr>
           <w:sz w:val="20"/>
           <w:szCs w:val="20"/>
         </w:rPr>
-        <w:t>7–450, 2000, doi: 10.1016/S0169-2070(00)00065-0.</w:t>
-      </w:r>
-    </w:p>
-    <w:p>
-      <w:pPr>
-        <w:spacing w:after="80"/>
-        <w:ind w:left="567" w:hanging="567"/>
-      </w:pPr>
+        <w:t>[19]</w:t>
+      </w:r>
       <w:r>
         <w:rPr>
           <w:sz w:val="20"/>
           <w:szCs w:val="20"/>
         </w:rPr>
-        <w:t>[20]</w:t>
-      </w:r>
-      <w:r>
-        <w:rPr>
-          <w:sz w:val="20"/>
-          <w:szCs w:val="20"/>
-        </w:rPr>
         <w:tab/>
-        <w:t xml:space="preserve">ISO 8601-1:2019, </w:t>
+        <w:t xml:space="preserve">L. J. Tashman, "Out-of-sample tests of forecasting accuracy: An analysis and review," </w:t>
       </w:r>
       <w:r>
         <w:rPr>
@@ -26832,14 +26881,14 @@
           <w:sz w:val="20"/>
           <w:szCs w:val="20"/>
         </w:rPr>
-        <w:t>Date and time — Representations for information interchange — Part 1: Basic rules</w:t>
+        <w:t>Int. J. Forecast.</w:t>
       </w:r>
       <w:r>
         <w:rPr>
           <w:sz w:val="20"/>
           <w:szCs w:val="20"/>
         </w:rPr>
-        <w:t>, International Organization for Standardization, Ginebra, Suiza, 2019.</w:t>
+        <w:t>, vol. 16, no. 4, pp. 437–450, 2000, doi: 10.1016/S0169-2070(00)00065-0.</w:t>
       </w:r>
     </w:p>
     <w:p>
@@ -26852,7 +26901,7 @@
           <w:sz w:val="20"/>
           <w:szCs w:val="20"/>
         </w:rPr>
-        <w:t>[21]</w:t>
+        <w:t>[20]</w:t>
       </w:r>
       <w:r>
         <w:rPr>
@@ -26860,63 +26909,14 @@
           <w:szCs w:val="20"/>
         </w:rPr>
         <w:tab/>
-        <w:t>Comisión de Regulación de E</w:t>
+        <w:t>I</w:t>
       </w:r>
       <w:r>
         <w:rPr>
           <w:sz w:val="20"/>
           <w:szCs w:val="20"/>
         </w:rPr>
-        <w:t>nergía y Gas (CREG), "Resolución CREG 101 018 de 2022," Bogotá, Colombia, 2022.</w:t>
-      </w:r>
-    </w:p>
-    <w:p>
-      <w:pPr>
-        <w:spacing w:after="80"/>
-        <w:ind w:left="567" w:hanging="567"/>
-      </w:pPr>
-      <w:r>
-        <w:rPr>
-          <w:sz w:val="20"/>
-          <w:szCs w:val="20"/>
-        </w:rPr>
-        <w:t>[22]</w:t>
-      </w:r>
-      <w:r>
-        <w:rPr>
-          <w:sz w:val="20"/>
-          <w:szCs w:val="20"/>
-        </w:rPr>
-        <w:tab/>
-        <w:t>Congreso de la República de Colombia, "Ley Estatutaria 1581 de 2012, por la cual se dictan disposiciones generales para la protección de datos personales," Bogotá, Colombi</w:t>
-      </w:r>
-      <w:r>
-        <w:rPr>
-          <w:sz w:val="20"/>
-          <w:szCs w:val="20"/>
-        </w:rPr>
-        <w:t>a, oct. 2012.</w:t>
-      </w:r>
-    </w:p>
-    <w:p>
-      <w:pPr>
-        <w:spacing w:after="80"/>
-        <w:ind w:left="567" w:hanging="567"/>
-      </w:pPr>
-      <w:r>
-        <w:rPr>
-          <w:sz w:val="20"/>
-          <w:szCs w:val="20"/>
-        </w:rPr>
-        <w:t>[23]</w:t>
-      </w:r>
-      <w:r>
-        <w:rPr>
-          <w:sz w:val="20"/>
-          <w:szCs w:val="20"/>
-        </w:rPr>
-        <w:tab/>
-        <w:t xml:space="preserve">ISO/IEC 25010:2011, </w:t>
+        <w:t xml:space="preserve">SO 8601-1:2019, </w:t>
       </w:r>
       <w:r>
         <w:rPr>
@@ -26924,14 +26924,14 @@
           <w:sz w:val="20"/>
           <w:szCs w:val="20"/>
         </w:rPr>
-        <w:t>Systems and software engineering — Systems and software Quality Requirements and Evaluation (SQuaRE) — System and software quality models</w:t>
+        <w:t>Date and time — Representations for information interchange — Part 1: Basic rules</w:t>
       </w:r>
       <w:r>
         <w:rPr>
           <w:sz w:val="20"/>
           <w:szCs w:val="20"/>
         </w:rPr>
-        <w:t>, ISO/IEC, Ginebra, Suiza, 2011.</w:t>
+        <w:t>, International Organization for Standardization, Ginebra, Suiza, 2019.</w:t>
       </w:r>
     </w:p>
     <w:p>
@@ -26944,7 +26944,7 @@
           <w:sz w:val="20"/>
           <w:szCs w:val="20"/>
         </w:rPr>
-        <w:t>[24]</w:t>
+        <w:t>[21]</w:t>
       </w:r>
       <w:r>
         <w:rPr>
@@ -26952,7 +26952,56 @@
           <w:szCs w:val="20"/>
         </w:rPr>
         <w:tab/>
-        <w:t xml:space="preserve">T. Bollerslev, "Generalized autoregressive conditional heteroskedasticity," </w:t>
+        <w:t>Comisión de Regulación de Energía y Gas (CREG), "Resolución CREG 101 018 de 2022,"</w:t>
+      </w:r>
+      <w:r>
+        <w:rPr>
+          <w:sz w:val="20"/>
+          <w:szCs w:val="20"/>
+        </w:rPr>
+        <w:t xml:space="preserve"> Bogotá, Colombia, 2022.</w:t>
+      </w:r>
+    </w:p>
+    <w:p>
+      <w:pPr>
+        <w:spacing w:after="80"/>
+        <w:ind w:left="567" w:hanging="567"/>
+      </w:pPr>
+      <w:r>
+        <w:rPr>
+          <w:sz w:val="20"/>
+          <w:szCs w:val="20"/>
+        </w:rPr>
+        <w:t>[22]</w:t>
+      </w:r>
+      <w:r>
+        <w:rPr>
+          <w:sz w:val="20"/>
+          <w:szCs w:val="20"/>
+        </w:rPr>
+        <w:tab/>
+        <w:t>Congreso de la República de Colombia, "Ley Estatutaria 1581 de 2012, por la cual se dictan disposiciones generales para la protección de datos personales," Bogotá, Colombia, oct. 2012.</w:t>
+      </w:r>
+    </w:p>
+    <w:p>
+      <w:pPr>
+        <w:spacing w:after="80"/>
+        <w:ind w:left="567" w:hanging="567"/>
+      </w:pPr>
+      <w:r>
+        <w:rPr>
+          <w:sz w:val="20"/>
+          <w:szCs w:val="20"/>
+        </w:rPr>
+        <w:t>[23]</w:t>
+      </w:r>
+      <w:r>
+        <w:rPr>
+          <w:sz w:val="20"/>
+          <w:szCs w:val="20"/>
+        </w:rPr>
+        <w:tab/>
+        <w:t xml:space="preserve">ISO/IEC 25010:2011, </w:t>
       </w:r>
       <w:r>
         <w:rPr>
@@ -26960,7 +27009,42 @@
           <w:sz w:val="20"/>
           <w:szCs w:val="20"/>
         </w:rPr>
-        <w:t>J. Ec</w:t>
+        <w:t>Systems and software engineering — Systems and software Quality Requirements and Evaluation (SQuaRE) — System and software quality models</w:t>
+      </w:r>
+      <w:r>
+        <w:rPr>
+          <w:sz w:val="20"/>
+          <w:szCs w:val="20"/>
+        </w:rPr>
+        <w:t>, ISO/IEC, Ginebra, Suiza, 2011.</w:t>
+      </w:r>
+    </w:p>
+    <w:p>
+      <w:pPr>
+        <w:spacing w:after="80"/>
+        <w:ind w:left="567" w:hanging="567"/>
+      </w:pPr>
+      <w:r>
+        <w:rPr>
+          <w:sz w:val="20"/>
+          <w:szCs w:val="20"/>
+        </w:rPr>
+        <w:t>[24]</w:t>
+      </w:r>
+      <w:r>
+        <w:rPr>
+          <w:sz w:val="20"/>
+          <w:szCs w:val="20"/>
+        </w:rPr>
+        <w:tab/>
+        <w:t>T. Bollerslev, "Generalized autoregressive conditional h</w:t>
+      </w:r>
+      <w:r>
+        <w:rPr>
+          <w:sz w:val="20"/>
+          <w:szCs w:val="20"/>
+        </w:rPr>
+        <w:t xml:space="preserve">eteroskedasticity," </w:t>
       </w:r>
       <w:r>
         <w:rPr>
@@ -26968,7 +27052,7 @@
           <w:sz w:val="20"/>
           <w:szCs w:val="20"/>
         </w:rPr>
-        <w:t>onometrics</w:t>
+        <w:t>J. Econometrics</w:t>
       </w:r>
       <w:r>
         <w:rPr>
@@ -26988,6 +27072,7 @@
           <w:sz w:val="20"/>
           <w:szCs w:val="20"/>
         </w:rPr>
+        <w:lastRenderedPageBreak/>
         <w:t>[25]</w:t>
       </w:r>
       <w:r>
@@ -27004,42 +27089,7 @@
           <w:sz w:val="20"/>
           <w:szCs w:val="20"/>
         </w:rPr>
-        <w:t>Int. J. Forecast.</w:t>
-      </w:r>
-      <w:r>
-        <w:rPr>
-          <w:sz w:val="20"/>
-          <w:szCs w:val="20"/>
-        </w:rPr>
-        <w:t>, vol. 39, no. 2,</w:t>
-      </w:r>
-      <w:r>
-        <w:rPr>
-          <w:sz w:val="20"/>
-          <w:szCs w:val="20"/>
-        </w:rPr>
-        <w:t xml:space="preserve"> pp. 884–900, 2023, doi: 10.1016/j.ijforecast.2022.03.001.</w:t>
-      </w:r>
-    </w:p>
-    <w:p>
-      <w:pPr>
-        <w:spacing w:after="80"/>
-        <w:ind w:left="567" w:hanging="567"/>
-      </w:pPr>
-      <w:r>
-        <w:rPr>
-          <w:sz w:val="20"/>
-          <w:szCs w:val="20"/>
-        </w:rPr>
-        <w:t>[26]</w:t>
-      </w:r>
-      <w:r>
-        <w:rPr>
-          <w:sz w:val="20"/>
-          <w:szCs w:val="20"/>
-        </w:rPr>
-        <w:tab/>
-        <w:t xml:space="preserve">R. J. Hyndman y A. B. Koehler, "Another look at measures of forecast accuracy," </w:t>
+        <w:t>Int. J. F</w:t>
       </w:r>
       <w:r>
         <w:rPr>
@@ -27047,14 +27097,14 @@
           <w:sz w:val="20"/>
           <w:szCs w:val="20"/>
         </w:rPr>
-        <w:t>Int. J. Forecast.</w:t>
+        <w:t>orecast.</w:t>
       </w:r>
       <w:r>
         <w:rPr>
           <w:sz w:val="20"/>
           <w:szCs w:val="20"/>
         </w:rPr>
-        <w:t>, vol. 22, no. 4, pp. 679–688, 2006, doi: 10.1016/j.ijforecast.2006.03.001.</w:t>
+        <w:t>, vol. 39, no. 2, pp. 884–900, 2023, doi: 10.1016/j.ijforecast.2022.03.001.</w:t>
       </w:r>
     </w:p>
     <w:p>
@@ -27067,7 +27117,7 @@
           <w:sz w:val="20"/>
           <w:szCs w:val="20"/>
         </w:rPr>
-        <w:t>[27]</w:t>
+        <w:t>[26]</w:t>
       </w:r>
       <w:r>
         <w:rPr>
@@ -27075,14 +27125,7 @@
           <w:szCs w:val="20"/>
         </w:rPr>
         <w:tab/>
-        <w:t>S. M. Lundberg</w:t>
-      </w:r>
-      <w:r>
-        <w:rPr>
-          <w:sz w:val="20"/>
-          <w:szCs w:val="20"/>
-        </w:rPr>
-        <w:t xml:space="preserve"> y S.-I. Lee, "A unified approach to interpreting model predictions," en </w:t>
+        <w:t xml:space="preserve">R. J. Hyndman y A. B. Koehler, "Another look at measures of forecast accuracy," </w:t>
       </w:r>
       <w:r>
         <w:rPr>
@@ -27090,14 +27133,21 @@
           <w:sz w:val="20"/>
           <w:szCs w:val="20"/>
         </w:rPr>
-        <w:t>Adv. Neural Inf. Process. Syst. 30 (NIPS 2017)</w:t>
+        <w:t>Int. J. Forecast.</w:t>
       </w:r>
       <w:r>
         <w:rPr>
           <w:sz w:val="20"/>
           <w:szCs w:val="20"/>
         </w:rPr>
-        <w:t>, Long Beach, CA, EE. UU., 2017.</w:t>
+        <w:t>, vol. 22, no. 4, pp. 679–688, 2006, doi: 10.1016/j.ijforecast.2006.03</w:t>
+      </w:r>
+      <w:r>
+        <w:rPr>
+          <w:sz w:val="20"/>
+          <w:szCs w:val="20"/>
+        </w:rPr>
+        <w:t>.001.</w:t>
       </w:r>
     </w:p>
     <w:p>
@@ -27110,7 +27160,7 @@
           <w:sz w:val="20"/>
           <w:szCs w:val="20"/>
         </w:rPr>
-        <w:t>[28]</w:t>
+        <w:t>[27]</w:t>
       </w:r>
       <w:r>
         <w:rPr>
@@ -27118,7 +27168,7 @@
           <w:szCs w:val="20"/>
         </w:rPr>
         <w:tab/>
-        <w:t xml:space="preserve">T. Chen y C. Guestrin, "XGBoost: A scalable tree boosting system," en </w:t>
+        <w:t xml:space="preserve">S. M. Lundberg y S.-I. Lee, "A unified approach to interpreting model predictions," en </w:t>
       </w:r>
       <w:r>
         <w:rPr>
@@ -27126,7 +27176,35 @@
           <w:sz w:val="20"/>
           <w:szCs w:val="20"/>
         </w:rPr>
-        <w:t>Proc. 22nd ACM SIGKDD Int. Co</w:t>
+        <w:t>Adv. Neural Inf. Process. Syst. 30 (NIPS 2017)</w:t>
+      </w:r>
+      <w:r>
+        <w:rPr>
+          <w:sz w:val="20"/>
+          <w:szCs w:val="20"/>
+        </w:rPr>
+        <w:t>, Long Beach, CA, EE. UU., 2017.</w:t>
+      </w:r>
+    </w:p>
+    <w:p>
+      <w:pPr>
+        <w:spacing w:after="80"/>
+        <w:ind w:left="567" w:hanging="567"/>
+      </w:pPr>
+      <w:r>
+        <w:rPr>
+          <w:sz w:val="20"/>
+          <w:szCs w:val="20"/>
+        </w:rPr>
+        <w:t>[28]</w:t>
+      </w:r>
+      <w:r>
+        <w:rPr>
+          <w:sz w:val="20"/>
+          <w:szCs w:val="20"/>
+        </w:rPr>
+        <w:tab/>
+        <w:t xml:space="preserve">T. Chen y C. Guestrin, "XGBoost: A scalable tree boosting system," en </w:t>
       </w:r>
       <w:r>
         <w:rPr>
@@ -27134,42 +27212,7 @@
           <w:sz w:val="20"/>
           <w:szCs w:val="20"/>
         </w:rPr>
-        <w:t>nf. Knowl. Discov. Data Min.</w:t>
-      </w:r>
-      <w:r>
-        <w:rPr>
-          <w:sz w:val="20"/>
-          <w:szCs w:val="20"/>
-        </w:rPr>
-        <w:t>, San Francisco, CA, EE. UU., 2016, pp. 785–794.</w:t>
-      </w:r>
-    </w:p>
-    <w:p>
-      <w:pPr>
-        <w:spacing w:after="80"/>
-        <w:ind w:left="567" w:hanging="567"/>
-      </w:pPr>
-      <w:r>
-        <w:rPr>
-          <w:sz w:val="20"/>
-          <w:szCs w:val="20"/>
-        </w:rPr>
-        <w:t>[29]</w:t>
-      </w:r>
-      <w:r>
-        <w:rPr>
-          <w:sz w:val="20"/>
-          <w:szCs w:val="20"/>
-        </w:rPr>
-        <w:tab/>
-        <w:t>C. Challu, K. G. Olivares, B. N. Oreshkin, F. Garza Ramírez, M. Mergenthaler Canseco y A. Dubrawski, "NHITS: Neural hierarchical interpolation for time series forecasting," e</w:t>
-      </w:r>
-      <w:r>
-        <w:rPr>
-          <w:sz w:val="20"/>
-          <w:szCs w:val="20"/>
-        </w:rPr>
-        <w:t xml:space="preserve">n </w:t>
+        <w:t>Proc</w:t>
       </w:r>
       <w:r>
         <w:rPr>
@@ -27177,14 +27220,14 @@
           <w:sz w:val="20"/>
           <w:szCs w:val="20"/>
         </w:rPr>
-        <w:t>Proc. AAAI Conf. Artif. Intell.</w:t>
+        <w:t>. 22nd ACM SIGKDD Int. Conf. Knowl. Discov. Data Min.</w:t>
       </w:r>
       <w:r>
         <w:rPr>
           <w:sz w:val="20"/>
           <w:szCs w:val="20"/>
         </w:rPr>
-        <w:t>, vol. 37, no. 6, 2023, pp. 6989–6997, doi: 10.1609/aaai.v37i6.25854.</w:t>
+        <w:t>, San Francisco, CA, EE. UU., 2016, pp. 785–794.</w:t>
       </w:r>
     </w:p>
     <w:p>
@@ -27197,7 +27240,7 @@
           <w:sz w:val="20"/>
           <w:szCs w:val="20"/>
         </w:rPr>
-        <w:t>[30]</w:t>
+        <w:t>[29]</w:t>
       </w:r>
       <w:r>
         <w:rPr>
@@ -27205,7 +27248,14 @@
           <w:szCs w:val="20"/>
         </w:rPr>
         <w:tab/>
-        <w:t xml:space="preserve">D. B. Nelson, "Conditional heteroskedasticity in asset returns: A new approach," </w:t>
+        <w:t>C. Challu, K. G. Olivares, B. N. Oreshkin, F. Garza Ramírez, M. Mergenthaler Canseco y A. Dubrawski, "NHITS: Neural hierarchical interpolation for ti</w:t>
+      </w:r>
+      <w:r>
+        <w:rPr>
+          <w:sz w:val="20"/>
+          <w:szCs w:val="20"/>
+        </w:rPr>
+        <w:t xml:space="preserve">me series forecasting," en </w:t>
       </w:r>
       <w:r>
         <w:rPr>
@@ -27213,14 +27263,14 @@
           <w:sz w:val="20"/>
           <w:szCs w:val="20"/>
         </w:rPr>
-        <w:t>Econometrica</w:t>
+        <w:t>Proc. AAAI Conf. Artif. Intell.</w:t>
       </w:r>
       <w:r>
         <w:rPr>
           <w:sz w:val="20"/>
           <w:szCs w:val="20"/>
         </w:rPr>
-        <w:t>, vol. 59, no. 2, pp. 347–370, 1991.</w:t>
+        <w:t>, vol. 37, no. 6, 2023, pp. 6989–6997, doi: 10.1609/aaai.v37i6.25854.</w:t>
       </w:r>
     </w:p>
     <w:p>
@@ -27233,7 +27283,7 @@
           <w:sz w:val="20"/>
           <w:szCs w:val="20"/>
         </w:rPr>
-        <w:t>[31]</w:t>
+        <w:t>[30]</w:t>
       </w:r>
       <w:r>
         <w:rPr>
@@ -27241,7 +27291,7 @@
           <w:szCs w:val="20"/>
         </w:rPr>
         <w:tab/>
-        <w:t xml:space="preserve">J. W. Tukey, </w:t>
+        <w:t xml:space="preserve">D. B. Nelson, "Conditional heteroskedasticity in asset returns: A new approach," </w:t>
       </w:r>
       <w:r>
         <w:rPr>
@@ -27249,14 +27299,21 @@
           <w:sz w:val="20"/>
           <w:szCs w:val="20"/>
         </w:rPr>
-        <w:t>Exploratory Data Analysis</w:t>
+        <w:t>Econometrica</w:t>
       </w:r>
       <w:r>
         <w:rPr>
           <w:sz w:val="20"/>
           <w:szCs w:val="20"/>
         </w:rPr>
-        <w:t>. Reading, MA, EE. UU.: Addison-Wesley, 1977.</w:t>
+        <w:t>, vol. 59, no. 2, pp. 347–370,</w:t>
+      </w:r>
+      <w:r>
+        <w:rPr>
+          <w:sz w:val="20"/>
+          <w:szCs w:val="20"/>
+        </w:rPr>
+        <w:t xml:space="preserve"> 1991.</w:t>
       </w:r>
     </w:p>
     <w:p>
@@ -27269,8 +27326,7 @@
           <w:sz w:val="20"/>
           <w:szCs w:val="20"/>
         </w:rPr>
-        <w:lastRenderedPageBreak/>
-        <w:t>[32]</w:t>
+        <w:t>[31]</w:t>
       </w:r>
       <w:r>
         <w:rPr>
@@ -27278,7 +27334,7 @@
           <w:szCs w:val="20"/>
         </w:rPr>
         <w:tab/>
-        <w:t xml:space="preserve">J. Gama, I. Žliobaitė, A. Bifet, M. Pechenizkiy y A. Bouchachia, "A survey on concept drift adaptation," </w:t>
+        <w:t xml:space="preserve">J. W. Tukey, </w:t>
       </w:r>
       <w:r>
         <w:rPr>
@@ -27286,14 +27342,14 @@
           <w:sz w:val="20"/>
           <w:szCs w:val="20"/>
         </w:rPr>
-        <w:t>ACM Comput. Surv.</w:t>
+        <w:t>Exploratory Data Analysis</w:t>
       </w:r>
       <w:r>
         <w:rPr>
           <w:sz w:val="20"/>
           <w:szCs w:val="20"/>
         </w:rPr>
-        <w:t>, vol. 46, no. 4, art. 44, 2014, doi: 10.1145/2523813.</w:t>
+        <w:t>. Reading, MA, EE. UU.: Addison-Wesley, 1977.</w:t>
       </w:r>
     </w:p>
     <w:p>
@@ -27306,22 +27362,15 @@
           <w:sz w:val="20"/>
           <w:szCs w:val="20"/>
         </w:rPr>
-        <w:t>[33</w:t>
+        <w:t>[32]</w:t>
       </w:r>
       <w:r>
         <w:rPr>
           <w:sz w:val="20"/>
           <w:szCs w:val="20"/>
         </w:rPr>
-        <w:t>]</w:t>
-      </w:r>
-      <w:r>
-        <w:rPr>
-          <w:sz w:val="20"/>
-          <w:szCs w:val="20"/>
-        </w:rPr>
         <w:tab/>
-        <w:t xml:space="preserve">A. Wald, </w:t>
+        <w:t xml:space="preserve">J. Gama, I. Žliobaitė, A. Bifet, M. Pechenizkiy y A. Bouchachia, "A survey on concept drift adaptation," </w:t>
       </w:r>
       <w:r>
         <w:rPr>
@@ -27329,14 +27378,21 @@
           <w:sz w:val="20"/>
           <w:szCs w:val="20"/>
         </w:rPr>
-        <w:t>Statistical Decision Functions</w:t>
+        <w:t>ACM Comput. Surv.</w:t>
       </w:r>
       <w:r>
         <w:rPr>
           <w:sz w:val="20"/>
           <w:szCs w:val="20"/>
         </w:rPr>
-        <w:t>. Nueva York, NY, EE. UU.: Wiley, 1950.</w:t>
+        <w:t xml:space="preserve">, vol. 46, no. 4, art. 44, 2014, </w:t>
+      </w:r>
+      <w:r>
+        <w:rPr>
+          <w:sz w:val="20"/>
+          <w:szCs w:val="20"/>
+        </w:rPr>
+        <w:t>doi: 10.1145/2523813.</w:t>
       </w:r>
     </w:p>
     <w:p>
@@ -27349,7 +27405,7 @@
           <w:sz w:val="20"/>
           <w:szCs w:val="20"/>
         </w:rPr>
-        <w:t>[34]</w:t>
+        <w:t>[33]</w:t>
       </w:r>
       <w:r>
         <w:rPr>
@@ -27357,7 +27413,7 @@
           <w:szCs w:val="20"/>
         </w:rPr>
         <w:tab/>
-        <w:t xml:space="preserve">W. K. Newey y K. D. West, "A simple, positive semi-definite, heteroskedasticity and autocorrelation consistent covariance matrix," </w:t>
+        <w:t xml:space="preserve">A. Wald, </w:t>
       </w:r>
       <w:r>
         <w:rPr>
@@ -27365,42 +27421,35 @@
           <w:sz w:val="20"/>
           <w:szCs w:val="20"/>
         </w:rPr>
-        <w:t>Econometrica</w:t>
+        <w:t>Statistical Decision Functions</w:t>
       </w:r>
       <w:r>
         <w:rPr>
           <w:sz w:val="20"/>
           <w:szCs w:val="20"/>
         </w:rPr>
-        <w:t>, vol. 55, no. 3, pp. 703–7</w:t>
-      </w:r>
+        <w:t>. Nueva York, NY, EE. UU.: Wiley, 1950.</w:t>
+      </w:r>
+    </w:p>
+    <w:p>
+      <w:pPr>
+        <w:spacing w:after="80"/>
+        <w:ind w:left="567" w:hanging="567"/>
+      </w:pPr>
       <w:r>
         <w:rPr>
           <w:sz w:val="20"/>
           <w:szCs w:val="20"/>
         </w:rPr>
-        <w:t>08, 1987, doi: 10.2307/1913610.</w:t>
-      </w:r>
-    </w:p>
-    <w:p>
-      <w:pPr>
-        <w:spacing w:after="80"/>
-        <w:ind w:left="567" w:hanging="567"/>
-      </w:pPr>
+        <w:t>[34]</w:t>
+      </w:r>
       <w:r>
         <w:rPr>
           <w:sz w:val="20"/>
           <w:szCs w:val="20"/>
         </w:rPr>
-        <w:t>[35]</w:t>
-      </w:r>
-      <w:r>
-        <w:rPr>
-          <w:sz w:val="20"/>
-          <w:szCs w:val="20"/>
-        </w:rPr>
         <w:tab/>
-        <w:t xml:space="preserve">A. V. Oppenheim y R. W. Schafer, </w:t>
+        <w:t xml:space="preserve">W. K. Newey y K. D. West, "A simple, positive semi-definite, heteroskedasticity and autocorrelation consistent covariance matrix," </w:t>
       </w:r>
       <w:r>
         <w:rPr>
@@ -27408,14 +27457,21 @@
           <w:sz w:val="20"/>
           <w:szCs w:val="20"/>
         </w:rPr>
-        <w:t>Discrete-Time Signal Processing</w:t>
+        <w:t>Econometrica</w:t>
       </w:r>
       <w:r>
         <w:rPr>
           <w:sz w:val="20"/>
           <w:szCs w:val="20"/>
         </w:rPr>
-        <w:t>, 3.ª ed. Upper Saddle River, NJ, EE. UU.: Pearson, 2010.</w:t>
+        <w:t xml:space="preserve">, </w:t>
+      </w:r>
+      <w:r>
+        <w:rPr>
+          <w:sz w:val="20"/>
+          <w:szCs w:val="20"/>
+        </w:rPr>
+        <w:t>vol. 55, no. 3, pp. 703–708, 1987, doi: 10.2307/1913610.</w:t>
       </w:r>
     </w:p>
     <w:p>
@@ -27428,7 +27484,7 @@
           <w:sz w:val="20"/>
           <w:szCs w:val="20"/>
         </w:rPr>
-        <w:t>[36]</w:t>
+        <w:t>[35]</w:t>
       </w:r>
       <w:r>
         <w:rPr>
@@ -27436,14 +27492,7 @@
           <w:szCs w:val="20"/>
         </w:rPr>
         <w:tab/>
-        <w:t>A. Savitzky y M. J. E. Golay, "Smoothing and differentiation of data by simplified least squ</w:t>
-      </w:r>
-      <w:r>
-        <w:rPr>
-          <w:sz w:val="20"/>
-          <w:szCs w:val="20"/>
-        </w:rPr>
-        <w:t xml:space="preserve">ares procedures," </w:t>
+        <w:t xml:space="preserve">A. V. Oppenheim y R. W. Schafer, </w:t>
       </w:r>
       <w:r>
         <w:rPr>
@@ -27451,14 +27500,14 @@
           <w:sz w:val="20"/>
           <w:szCs w:val="20"/>
         </w:rPr>
-        <w:t>Anal. Chem.</w:t>
+        <w:t>Discrete-Time Signal Processing</w:t>
       </w:r>
       <w:r>
         <w:rPr>
           <w:sz w:val="20"/>
           <w:szCs w:val="20"/>
         </w:rPr>
-        <w:t>, vol. 36, no. 8, pp. 1627–1639, 1964, doi: 10.1021/ac60214a047.</w:t>
+        <w:t>, 3.ª ed. Upper Saddle River, NJ, EE. UU.: Pearson, 2010.</w:t>
       </w:r>
     </w:p>
     <w:p>
@@ -27471,7 +27520,7 @@
           <w:sz w:val="20"/>
           <w:szCs w:val="20"/>
         </w:rPr>
-        <w:t>[37]</w:t>
+        <w:t>[36]</w:t>
       </w:r>
       <w:r>
         <w:rPr>
@@ -27479,7 +27528,14 @@
           <w:szCs w:val="20"/>
         </w:rPr>
         <w:tab/>
-        <w:t xml:space="preserve">A. Garivier y E. Moulines, "On upper-confidence bound policies for switching bandit problems," en </w:t>
+        <w:t>A. Savitzky y M. J. E. Golay, "Smoothing and differentiation of dat</w:t>
+      </w:r>
+      <w:r>
+        <w:rPr>
+          <w:sz w:val="20"/>
+          <w:szCs w:val="20"/>
+        </w:rPr>
+        <w:t xml:space="preserve">a by simplified least squares procedures," </w:t>
       </w:r>
       <w:r>
         <w:rPr>
@@ -27487,21 +27543,58 @@
           <w:sz w:val="20"/>
           <w:szCs w:val="20"/>
         </w:rPr>
-        <w:t>Algorithmic Learning Theory (ALT 2011)</w:t>
+        <w:t>Anal. Chem.</w:t>
       </w:r>
       <w:r>
         <w:rPr>
           <w:sz w:val="20"/>
           <w:szCs w:val="20"/>
         </w:rPr>
-        <w:t>, LNCS, vol. 6925. Be</w:t>
-      </w:r>
+        <w:t>, vol. 36, no. 8, pp. 1627–1639, 1964, doi: 10.1021/ac60214a047.</w:t>
+      </w:r>
+    </w:p>
+    <w:p>
+      <w:pPr>
+        <w:spacing w:after="80"/>
+        <w:ind w:left="567" w:hanging="567"/>
+      </w:pPr>
       <w:r>
         <w:rPr>
           <w:sz w:val="20"/>
           <w:szCs w:val="20"/>
         </w:rPr>
-        <w:t>rlín, Alemania: Springer, 2011, pp. 174–188.</w:t>
+        <w:t>[37]</w:t>
+      </w:r>
+      <w:r>
+        <w:rPr>
+          <w:sz w:val="20"/>
+          <w:szCs w:val="20"/>
+        </w:rPr>
+        <w:tab/>
+        <w:t xml:space="preserve">A. Garivier y E. Moulines, "On upper-confidence bound policies for switching bandit problems," en </w:t>
+      </w:r>
+      <w:r>
+        <w:rPr>
+          <w:i/>
+          <w:sz w:val="20"/>
+          <w:szCs w:val="20"/>
+        </w:rPr>
+        <w:t>Algorithmic Learning Theory (ALT 2</w:t>
+      </w:r>
+      <w:r>
+        <w:rPr>
+          <w:i/>
+          <w:sz w:val="20"/>
+          <w:szCs w:val="20"/>
+        </w:rPr>
+        <w:t>011)</w:t>
+      </w:r>
+      <w:r>
+        <w:rPr>
+          <w:sz w:val="20"/>
+          <w:szCs w:val="20"/>
+        </w:rPr>
+        <w:t>, LNCS, vol. 6925. Berlín, Alemania: Springer, 2011, pp. 174–188.</w:t>
       </w:r>
     </w:p>
     <w:p>
@@ -27517,7 +27610,7 @@
       <w:bookmarkStart w:id="140" w:name="_Toc240440270"/>
       <w:bookmarkStart w:id="141" w:name="_Toc241072144"/>
       <w:bookmarkStart w:id="142" w:name="_Toc241072508"/>
-      <w:bookmarkStart w:id="143" w:name="_Toc241498869"/>
+      <w:bookmarkStart w:id="143" w:name="_Toc241499471"/>
       <w:r>
         <w:t>Anexos</w:t>
       </w:r>
@@ -27562,7 +27655,10 @@
         <w:spacing w:after="80"/>
       </w:pPr>
       <w:r>
-        <w:t>Anexo 3 — Código fuente / firmware</w:t>
+        <w:t xml:space="preserve">Anexo 3 — Código fuente / </w:t>
+      </w:r>
+      <w:r>
+        <w:t>firmware</w:t>
       </w:r>
       <w:r>
         <w:t>/ Planos / Circuitos/especificaciones técnicas</w:t>
@@ -27617,10 +27713,10 @@
         <w:spacing w:after="80"/>
       </w:pPr>
       <w:r>
-        <w:t xml:space="preserve">Anexo 7 — Evidencia de trabajo en equipo (bitácoras, minutas, </w:t>
-      </w:r>
-      <w:r>
-        <w:t>evaluación de pares / TEAMMATES)</w:t>
+        <w:t>Anexo 7 — Evidencia de trabajo en equipo (</w:t>
+      </w:r>
+      <w:r>
+        <w:t>bitácoras, minutas, evaluación de pares / TEAMMATES)</w:t>
       </w:r>
     </w:p>
     <w:p>
@@ -27642,10 +27738,10 @@
         <w:jc w:val="both"/>
       </w:pPr>
       <w:r>
-        <w:t>Los anexos 1, 3 y 5 están en el repositorio del proyecto (github.com/Ziskito/xm-spot-price-predictor): formulación en docs/, código fuente en notebooks/, src/, dashboard/ y scrip</w:t>
-      </w:r>
-      <w:r>
-        <w:t>ts_experimento/, y datos y predicciones en data/. El anexo 2 corresponde a docs/tabla_riesgos_proyecto.xlsx y el anexo 7, a la bitácora del README y al historial de commits.</w:t>
+        <w:t>Los anexos 1, 3 y 5 están en el repositorio del proyecto (github.com/Ziskito/xm-spot-price-predictor): formulación en docs/, código fuente en notebooks/, src/</w:t>
+      </w:r>
+      <w:r>
+        <w:t>, dashboard/ y scripts_experimento/, y datos y predicciones en data/. El anexo 2 corresponde a docs/tabla_riesgos_proyecto.xlsx y el anexo 7, a la bitácora del README y al historial de commits.</w:t>
       </w:r>
     </w:p>
     <w:p/>
@@ -27731,7 +27827,15 @@
         <w:sz w:val="16"/>
         <w:szCs w:val="16"/>
       </w:rPr>
-      <w:t>Informe Final — Proyecto Final (Capstone Design)</w:t>
+      <w:t>Informe Final — Proyecto Final (</w:t>
+    </w:r>
+    <w:r>
+      <w:rPr>
+        <w:color w:val="595959"/>
+        <w:sz w:val="16"/>
+        <w:szCs w:val="16"/>
+      </w:rPr>
+      <w:t>Capstone Design)</w:t>
     </w:r>
   </w:p>
 </w:hdr>

</xml_diff>